<commit_message>
M15 amendment 1 P1 outputs regenerated at 8df65d0 after verification (summary, extract, ppcstored, p1report, appendix)
Co-Authored-By: Claude Opus 5.5 <noreply@anthropic.com>
Claude-Session: https://claude.ai/code/session_01VcVRPzFxTqkW2KRC1Wkk1r
</commit_message>
<xml_diff>
--- a/results/m15/amend1/appendix/M15_MS_appendix_draft.docx
+++ b/results/m15/amend1/appendix/M15_MS_appendix_draft.docx
@@ -16,7 +16,7 @@
         <w:pStyle w:val="FirstParagraph"/>
       </w:pPr>
       <w:r>
-        <w:t xml:space="preserve">Draft for the European Medicines Agency (EMA) scientific advice briefing document. Structured as in the International Council for Harmonisation (ICH) M15 guideline. Generated on 2026-10-21 from the result files at commit 3a6b66a (plan</w:t>
+        <w:t xml:space="preserve">Draft for the European Medicines Agency (EMA) scientific advice briefing document. Structured as in the International Council for Harmonisation (ICH) M15 guideline. Generated on 2026-10-21 from the result files at commit 8df65d0 (plan</w:t>
       </w:r>
       <w:r>
         <w:t xml:space="preserve"> </w:t>
@@ -28,7 +28,16 @@
         <w:t xml:space="preserve">plans/M15_analysis_plan_20261020.md</w:t>
       </w:r>
       <w:r>
-        <w:t xml:space="preserve">, amendment 1, section 16). Every number is read from a result file.</w:t>
+        <w:t xml:space="preserve">, amendment 1, section 16). Every result is read from a result file and every design setting from the registered configuration (</w:t>
+      </w:r>
+      <w:r>
+        <w:rPr>
+          <w:rStyle w:val="VerbatimChar"/>
+        </w:rPr>
+        <w:t xml:space="preserve">config/prereg_20261020_m15.yaml</w:t>
+      </w:r>
+      <w:r>
+        <w:t xml:space="preserve">).</w:t>
       </w:r>
     </w:p>
     <w:p>
@@ -36,7 +45,7 @@
         <w:pStyle w:val="BodyText"/>
       </w:pPr>
       <w:r>
-        <w:t xml:space="preserve">Model 1 is Kovalenko 2020 Table 1 Model 1, the initial base structural model reviewed by the US Food and Drug Administration (FDA) in its 2017 clinical pharmacology review (section 4.6); Kovalenko 2016 is the sensitivity model.</w:t>
+        <w:t xml:space="preserve">Model 1 is Kovalenko 2020 Table 1 Model 1, the initial base structural model reviewed by the US Food and Drug Administration (FDA) in its 2017 clinical pharmacology review (section 4.6); it remains the primary model as registered, and Kovalenko 2016 is the sensitivity model.</w:t>
       </w:r>
     </w:p>
     <w:p>
@@ -52,7 +61,7 @@
         <w:pStyle w:val="BodyText"/>
       </w:pPr>
       <w:r>
-        <w:t xml:space="preserve">Abbreviations: AUC0-inf, area under the concentration-time curve from time zero to infinity; AUC0-last, area to the last quantifiable concentration; AUROC, area under the receiver operating characteristic curve; CI, confidence interval; Cmax, maximum concentration; CV, coefficient of variation; EU, European Union; F, bioavailability; FDA, US Food and Drug Administration; GMR, geometric mean ratio; I2, I-squared, the share of the variation between arm means beyond within-arm sampling error; ka, absorption rate constant; ke, linear elimination rate constant; lambda_z, terminal elimination rate constant; LLOQ, lower limit of quantification; NCA, non-compartmental analysis; PK, pharmacokinetic; RMSE, root mean square error; SD, standard deviation; Vmax, maximum Michaelis-Menten elimination rate.</w:t>
+        <w:t xml:space="preserve">Abbreviations: AUC0-inf, area under the concentration-time curve from time zero to infinity; AUC0-last, area to the last quantifiable concentration; AUROC, area under the receiver operating characteristic curve; CI, confidence interval; Cmax, maximum concentration; CV, coefficient of variation; EU, European Union; F, bioavailability; FDA, US Food and Drug Administration; GMR, geometric mean ratio; I2, I-squared, the share of the variation between arm means beyond within-arm sampling error; ka, absorption rate constant; ke, linear elimination rate constant; lambda_z, terminal elimination rate constant; LLOQ, lower limit of quantification; NCA, non-compartmental analysis; PK, pharmacokinetic; pp, percentage points; RMSE, root mean square error; SD, standard deviation; Vmax, maximum Michaelis-Menten elimination rate.</w:t>
       </w:r>
     </w:p>
     <w:bookmarkStart w:id="20" w:name="X55ee38ac193e981798b3747b4095225bff6d40f"/>
@@ -462,7 +471,7 @@
         <w:pStyle w:val="BodyText"/>
       </w:pPr>
       <w:r>
-        <w:t xml:space="preserve">Estimates and structure of both models are used as published; nothing is re-estimated. The publications and the FDA review could not be opened from the analysis environment, so the repository records and the sponsor's records are the source.</w:t>
+        <w:t xml:space="preserve">Estimates and structure of both models are used as published; nothing is re-estimated. The publications and the FDA review could not be opened from the analysis environment, so the repository records and the requester's statements of 2026-10-21 are the sources.</w:t>
       </w:r>
     </w:p>
     <w:bookmarkEnd w:id="21"/>
@@ -480,7 +489,7 @@
         <w:pStyle w:val="FirstParagraph"/>
       </w:pPr>
       <w:r>
-        <w:t xml:space="preserve">Arm means simulated 5,000 times with each study's design, dose, schedule and LLOQ (0.078 mg/L) under the registered fixed weight assumption (normal 78 kg, SD 10 kg, where weights are not reported). Each cell: predicted median (99% prediction interval); predicted/observed ratio; in-sample status.</w:t>
+        <w:t xml:space="preserve">Arm means simulated 5,000 times with each study's design, dose, schedule and LLOQ (0.078 mg/L) under the registered fixed weight assumption (where weights are not reported, normal mean 78 kg (80 kg for PKM14271), SD 10 kg, sex-specific default bounds; assumption B14). Each cell: predicted median (99% prediction interval); predicted/observed ratio; in-sample status.</w:t>
       </w:r>
     </w:p>
     <w:tbl>
@@ -608,7 +617,7 @@
               <w:jc w:val="left"/>
             </w:pPr>
             <w:r>
-              <w:t xml:space="preserve">AUC0-last</w:t>
+              <w:t xml:space="preserve">AUC0-last (mg x day/L)</w:t>
             </w:r>
           </w:p>
         </w:tc>
@@ -682,7 +691,7 @@
               <w:jc w:val="left"/>
             </w:pPr>
             <w:r>
-              <w:t xml:space="preserve">AUC0-last</w:t>
+              <w:t xml:space="preserve">AUC0-last (mg x day/L)</w:t>
             </w:r>
           </w:p>
         </w:tc>
@@ -756,7 +765,7 @@
               <w:jc w:val="left"/>
             </w:pPr>
             <w:r>
-              <w:t xml:space="preserve">AUC0-last</w:t>
+              <w:t xml:space="preserve">AUC0-last (mg x day/L)</w:t>
             </w:r>
           </w:p>
         </w:tc>
@@ -830,7 +839,7 @@
               <w:jc w:val="left"/>
             </w:pPr>
             <w:r>
-              <w:t xml:space="preserve">AUC0-last</w:t>
+              <w:t xml:space="preserve">AUC0-last (mg x day/L)</w:t>
             </w:r>
           </w:p>
         </w:tc>
@@ -904,7 +913,7 @@
               <w:jc w:val="left"/>
             </w:pPr>
             <w:r>
-              <w:t xml:space="preserve">AUC0-last</w:t>
+              <w:t xml:space="preserve">AUC0-last (mg x day/L)</w:t>
             </w:r>
           </w:p>
         </w:tc>
@@ -978,7 +987,7 @@
               <w:jc w:val="left"/>
             </w:pPr>
             <w:r>
-              <w:t xml:space="preserve">AUC0-last</w:t>
+              <w:t xml:space="preserve">AUC0-last (mg x day/L)</w:t>
             </w:r>
           </w:p>
         </w:tc>
@@ -1052,7 +1061,7 @@
               <w:jc w:val="left"/>
             </w:pPr>
             <w:r>
-              <w:t xml:space="preserve">AUC0-last</w:t>
+              <w:t xml:space="preserve">AUC0-last (mg x day/L)</w:t>
             </w:r>
           </w:p>
         </w:tc>
@@ -1126,7 +1135,7 @@
               <w:jc w:val="left"/>
             </w:pPr>
             <w:r>
-              <w:t xml:space="preserve">Cmax</w:t>
+              <w:t xml:space="preserve">Cmax (mg/L)</w:t>
             </w:r>
           </w:p>
         </w:tc>
@@ -1200,7 +1209,7 @@
               <w:jc w:val="left"/>
             </w:pPr>
             <w:r>
-              <w:t xml:space="preserve">AUC0-last</w:t>
+              <w:t xml:space="preserve">AUC0-last (mg x day/L)</w:t>
             </w:r>
           </w:p>
         </w:tc>
@@ -1274,7 +1283,7 @@
               <w:jc w:val="left"/>
             </w:pPr>
             <w:r>
-              <w:t xml:space="preserve">Cmax</w:t>
+              <w:t xml:space="preserve">Cmax (mg/L)</w:t>
             </w:r>
           </w:p>
         </w:tc>
@@ -1321,7 +1330,15 @@
         <w:pStyle w:val="BodyText"/>
       </w:pPr>
       <w:r>
-        <w:t xml:space="preserve">Products as recorded in the FDA 2017 review Tables 4.1.1.a, 4.2.a and 4.2.b: #2 (C1P2 vial), #6 (C2P1 vial), #7 (C2P1 prefilled syringe, the phase 3 and commercial product). The product of each arm other than the PKM14161 test arm is not yet recorded in the analysis repository.</w:t>
+        <w:t xml:space="preserve">Products as supplied by the requester from the FDA 2017 review Tables 4.1.1.a, 4.2.a and 4.2.b (not verified against the review): #2 (C1P2 vial), #6 (C2P1 vial), #7 (C2P1 prefilled syringe (phase 3 and commercial product)). The product of each arm other than the PKM14161 test arm is not yet recorded in the analysis repository.</w:t>
+      </w:r>
+    </w:p>
+    <w:p>
+      <w:pPr>
+        <w:pStyle w:val="BodyText"/>
+      </w:pPr>
+      <w:r>
+        <w:t xml:space="preserve">The misfit rule judges study units that pool both arms of a study. PKM12350 (both arms, n 28): observed mean AUC0-last 493.3 mg x day/L; Model 1 predicted median 620.5 (percentile rank 0.2, outside its 99% prediction interval); Kovalenko 2016 570.8 (percentile rank 2.1, outside the 95% but inside the 99% prediction interval).</w:t>
       </w:r>
     </w:p>
     <w:p>
@@ -1345,7 +1362,7 @@
         <w:pStyle w:val="BodyText"/>
       </w:pPr>
       <w:r>
-        <w:t xml:space="preserve">Posterior predictive check (Li 2020 healthy-volunteer studies): Model 1 met the misfit rule under the fixed weight assumption only (rule R4: the PKM12350 AUC0-last mean is outside its 99% prediction interval) and did not meet it under the uncertain-mean weight assumption; Kovalenko 2016 did not meet it under either weight assumption. The cause is under diagnosis (amendment section 16.7).</w:t>
+        <w:t xml:space="preserve">Posterior predictive check (Li 2020 healthy-volunteer studies): Model 1 met the misfit rule under the fixed weight assumption only (rule R4, the rule on out-of-sample units: the PKM12350 AUC0-last mean is outside its 99% prediction interval) and did not meet it under the uncertain-mean weight assumption; Kovalenko 2016 did not meet it under either weight assumption. The cause is under diagnosis (amendment section 16.7).</w:t>
       </w:r>
     </w:p>
     <w:p>
@@ -1505,7 +1522,7 @@
               <w:jc w:val="left"/>
             </w:pPr>
             <w:r>
-              <w:t xml:space="preserve">80 to 160 randomized per arm (base 130); 10% withdrawal completely at random; permuted blocks of two within weight strata</w:t>
+              <w:t xml:space="preserve">80 to 160 randomized per arm (base 130); 10% withdrawal completely at random; randomization: stratified permuted blocks of 2 within stratum in enrollment order; arm of size n = first n subjects allocated to that arm</w:t>
             </w:r>
           </w:p>
         </w:tc>
@@ -1557,7 +1574,7 @@
               <w:jc w:val="left"/>
             </w:pPr>
             <w:r>
-              <w:t xml:space="preserve">True GMR grid 0.80 to 1.25 (21 points) applied to test-arm concentrations; mechanism versions with test-arm F, ka, ke or Vmax multiplied by 0.60 to 2.00</w:t>
+              <w:t xml:space="preserve">True GMR grid 0.80 to 1.25 (21 points) applied to test-arm concentrations; mechanism versions with test-arm F, ka, ke, Vmax multiplied by 0.80 to 1.20; ke, Vmax, ka also at 0.60 to 1.50; ka also at 1.75 and 2.00</w:t>
             </w:r>
           </w:p>
         </w:tc>
@@ -1911,185 +1928,13 @@
           </w:p>
         </w:tc>
       </w:tr>
-      <w:tr>
-        <w:tc>
-          <w:tcPr/>
-          <w:p>
-            <w:pPr>
-              <w:pStyle w:val="Compact"/>
-              <w:jc w:val="left"/>
-            </w:pPr>
-            <w:r>
-              <w:t xml:space="preserve">Korean</w:t>
-            </w:r>
-          </w:p>
-        </w:tc>
-        <w:tc>
-          <w:tcPr/>
-          <w:p>
-            <w:pPr>
-              <w:pStyle w:val="Compact"/>
-              <w:jc w:val="left"/>
-            </w:pPr>
-            <w:r>
-              <w:t xml:space="preserve">Model 1</w:t>
-            </w:r>
-          </w:p>
-        </w:tc>
-        <w:tc>
-          <w:tcPr/>
-          <w:p>
-            <w:pPr>
-              <w:pStyle w:val="Compact"/>
-              <w:jc w:val="left"/>
-            </w:pPr>
-            <w:r>
-              <w:t xml:space="preserve">94.7 (93.1 to 95.9)</w:t>
-            </w:r>
-          </w:p>
-        </w:tc>
-        <w:tc>
-          <w:tcPr/>
-          <w:p>
-            <w:pPr>
-              <w:pStyle w:val="Compact"/>
-              <w:jc w:val="left"/>
-            </w:pPr>
-            <w:r>
-              <w:t xml:space="preserve">99.2 (98.4 to 99.6)</w:t>
-            </w:r>
-          </w:p>
-        </w:tc>
-        <w:tc>
-          <w:tcPr/>
-          <w:p>
-            <w:pPr>
-              <w:pStyle w:val="Compact"/>
-              <w:jc w:val="left"/>
-            </w:pPr>
-            <w:r>
-              <w:t xml:space="preserve">2.6 (2.3 to 2.9); 5.2</w:t>
-            </w:r>
-          </w:p>
-        </w:tc>
-        <w:tc>
-          <w:tcPr/>
-          <w:p>
-            <w:pPr>
-              <w:pStyle w:val="Compact"/>
-              <w:jc w:val="left"/>
-            </w:pPr>
-            <w:r>
-              <w:t xml:space="preserve">2.6 (2.3 to 2.9); 5.3</w:t>
-            </w:r>
-          </w:p>
-        </w:tc>
-        <w:tc>
-          <w:tcPr/>
-          <w:p>
-            <w:pPr>
-              <w:pStyle w:val="Compact"/>
-              <w:jc w:val="left"/>
-            </w:pPr>
-            <w:r>
-              <w:t xml:space="preserve">10,000</w:t>
-            </w:r>
-          </w:p>
-        </w:tc>
-      </w:tr>
-      <w:tr>
-        <w:tc>
-          <w:tcPr/>
-          <w:p>
-            <w:pPr>
-              <w:pStyle w:val="Compact"/>
-              <w:jc w:val="left"/>
-            </w:pPr>
-            <w:r>
-              <w:t xml:space="preserve">Korean</w:t>
-            </w:r>
-          </w:p>
-        </w:tc>
-        <w:tc>
-          <w:tcPr/>
-          <w:p>
-            <w:pPr>
-              <w:pStyle w:val="Compact"/>
-              <w:jc w:val="left"/>
-            </w:pPr>
-            <w:r>
-              <w:t xml:space="preserve">Kovalenko 2016</w:t>
-            </w:r>
-          </w:p>
-        </w:tc>
-        <w:tc>
-          <w:tcPr/>
-          <w:p>
-            <w:pPr>
-              <w:pStyle w:val="Compact"/>
-              <w:jc w:val="left"/>
-            </w:pPr>
-            <w:r>
-              <w:t xml:space="preserve">97.1 (95.9 to 98.0)</w:t>
-            </w:r>
-          </w:p>
-        </w:tc>
-        <w:tc>
-          <w:tcPr/>
-          <w:p>
-            <w:pPr>
-              <w:pStyle w:val="Compact"/>
-              <w:jc w:val="left"/>
-            </w:pPr>
-            <w:r>
-              <w:t xml:space="preserve">99.9 (99.4 to 100.0)</w:t>
-            </w:r>
-          </w:p>
-        </w:tc>
-        <w:tc>
-          <w:tcPr/>
-          <w:p>
-            <w:pPr>
-              <w:pStyle w:val="Compact"/>
-              <w:jc w:val="left"/>
-            </w:pPr>
-            <w:r>
-              <w:t xml:space="preserve">2.4 (1.6 to 3.5); 5.5</w:t>
-            </w:r>
-          </w:p>
-        </w:tc>
-        <w:tc>
-          <w:tcPr/>
-          <w:p>
-            <w:pPr>
-              <w:pStyle w:val="Compact"/>
-              <w:jc w:val="left"/>
-            </w:pPr>
-            <w:r>
-              <w:t xml:space="preserve">2.1 (1.4 to 3.2); 5.2</w:t>
-            </w:r>
-          </w:p>
-        </w:tc>
-        <w:tc>
-          <w:tcPr/>
-          <w:p>
-            <w:pPr>
-              <w:pStyle w:val="Compact"/>
-              <w:jc w:val="left"/>
-            </w:pPr>
-            <w:r>
-              <w:t xml:space="preserve">1,000</w:t>
-            </w:r>
-          </w:p>
-        </w:tc>
-      </w:tr>
     </w:tbl>
     <w:p>
       <w:pPr>
         <w:pStyle w:val="BodyText"/>
       </w:pPr>
       <w:r>
-        <w:t xml:space="preserve">Intervals are Wilson 95% intervals of the simulation (Monte Carlo) error only; they do not include parameter or model uncertainty.</w:t>
+        <w:t xml:space="preserve">Intervals are Wilson 95% intervals of the simulation (Monte Carlo) error only; they do not include parameter or model uncertainty. Korean-population operating characteristics other than power at GMR 0.95 (section 5.2) are not part of the P1 report and are not shown (plan section 16.6).</w:t>
       </w:r>
     </w:p>
     <w:bookmarkEnd w:id="24"/>
@@ -2190,7 +2035,7 @@
               <w:jc w:val="left"/>
             </w:pPr>
             <w:r>
-              <w:t xml:space="preserve">AUC0-last median error vs dense truth (%)</w:t>
+              <w:t xml:space="preserve">AUC0-last median error against the dense truth (%)</w:t>
             </w:r>
           </w:p>
         </w:tc>
@@ -3439,7 +3284,7 @@
               <w:jc w:val="left"/>
             </w:pPr>
             <w:r>
-              <w:t xml:space="preserve">88</w:t>
+              <w:t xml:space="preserve">-</w:t>
             </w:r>
           </w:p>
         </w:tc>
@@ -3475,7 +3320,7 @@
               <w:jc w:val="left"/>
             </w:pPr>
             <w:r>
-              <w:t xml:space="preserve">94.1</w:t>
+              <w:t xml:space="preserve">-</w:t>
             </w:r>
           </w:p>
         </w:tc>
@@ -3525,7 +3370,7 @@
               <w:jc w:val="left"/>
             </w:pPr>
             <w:r>
-              <w:t xml:space="preserve">82</w:t>
+              <w:t xml:space="preserve">-</w:t>
             </w:r>
           </w:p>
         </w:tc>
@@ -3561,12 +3406,20 @@
               <w:jc w:val="left"/>
             </w:pPr>
             <w:r>
-              <w:t xml:space="preserve">93.6</w:t>
+              <w:t xml:space="preserve">-</w:t>
             </w:r>
           </w:p>
         </w:tc>
       </w:tr>
     </w:tbl>
+    <w:p>
+      <w:pPr>
+        <w:pStyle w:val="BodyText"/>
+      </w:pPr>
+      <w:r>
+        <w:t xml:space="preserve">Korean values for 85% power and for assurance are not part of the P1 report and are not shown (plan section 16.6).</w:t>
+      </w:r>
+    </w:p>
     <w:bookmarkEnd w:id="26"/>
     <w:bookmarkStart w:id="27" w:name="body-weight-and-population"/>
     <w:p>
@@ -3826,7 +3679,7 @@
         <w:pStyle w:val="BodyText"/>
       </w:pPr>
       <w:r>
-        <w:t xml:space="preserve">The two models' weight ratios are near-equal by coincidence: weight acts only on the central volume in both models, with exponents 0.711 (Model 1) and 0.705 (Kovalenko 2016), and the implied weight elasticity of AUC0-inf at the global 5th percentile weight is 1.095 and 1.094. Each model was confirmed to run with its own exponent (independent recomputation of every stored ratio).</w:t>
+        <w:t xml:space="preserve">The two models' weight ratios are near-equal by coincidence: weight acts only on the central volume in both models, and the exponent times the normalized bioavailability sensitivity of AUC0-inf at the global median weight (76.0 kg) is 0.711 x 1.564 = 1.112 for Model 1 and 0.705 x 1.574 = 1.110 for Kovalenko 2016. Each model was confirmed to run with its own exponent (independent recomputation of every stored ratio).</w:t>
       </w:r>
     </w:p>
     <w:bookmarkEnd w:id="27"/>
@@ -3853,7 +3706,7 @@
         <w:pStyle w:val="BodyText"/>
       </w:pPr>
       <w:r>
-        <w:t xml:space="preserve">Rows are the primary scenario cell (global population; Korean minus global for the population contrast); the last column gives the class of the same contrast in the Korean population.</w:t>
+        <w:t xml:space="preserve">Rows are the primary scenario cell (global population; Korean minus global for the population contrast); the last column gives the same contrast in the Korean population. Values are differences with their 95% confidence intervals.</w:t>
       </w:r>
     </w:p>
     <w:tbl>
@@ -3943,7 +3796,7 @@
               <w:jc w:val="left"/>
             </w:pPr>
             <w:r>
-              <w:t xml:space="preserve">Class, Korean population</w:t>
+              <w:t xml:space="preserve">Korean population: Model 1; Kovalenko 2016 (class)</w:t>
             </w:r>
           </w:p>
         </w:tc>
@@ -3969,31 +3822,31 @@
               <w:jc w:val="left"/>
             </w:pPr>
             <w:r>
-              <w:t xml:space="preserve">power at true GMR 0.95</w:t>
-            </w:r>
-          </w:p>
-        </w:tc>
-        <w:tc>
-          <w:tcPr/>
-          <w:p>
-            <w:pPr>
-              <w:pStyle w:val="Compact"/>
-              <w:jc w:val="left"/>
-            </w:pPr>
-            <w:r>
-              <w:t xml:space="preserve">-0.2 pp, 95% CI -0.7 to 0.2</w:t>
-            </w:r>
-          </w:p>
-        </w:tc>
-        <w:tc>
-          <w:tcPr/>
-          <w:p>
-            <w:pPr>
-              <w:pStyle w:val="Compact"/>
-              <w:jc w:val="left"/>
-            </w:pPr>
-            <w:r>
-              <w:t xml:space="preserve">0.0 pp, 95% CI -0.4 to 0.4</w:t>
+              <w:t xml:space="preserve">power at true GMR 0.95 (pp)</w:t>
+            </w:r>
+          </w:p>
+        </w:tc>
+        <w:tc>
+          <w:tcPr/>
+          <w:p>
+            <w:pPr>
+              <w:pStyle w:val="Compact"/>
+              <w:jc w:val="left"/>
+            </w:pPr>
+            <w:r>
+              <w:t xml:space="preserve">-0.2 (-0.7 to 0.2)</w:t>
+            </w:r>
+          </w:p>
+        </w:tc>
+        <w:tc>
+          <w:tcPr/>
+          <w:p>
+            <w:pPr>
+              <w:pStyle w:val="Compact"/>
+              <w:jc w:val="left"/>
+            </w:pPr>
+            <w:r>
+              <w:t xml:space="preserve">0.0 (-0.4 to 0.4)</w:t>
             </w:r>
           </w:p>
         </w:tc>
@@ -4017,10 +3870,84 @@
               <w:jc w:val="left"/>
             </w:pPr>
             <w:r>
+              <w:t xml:space="preserve">-0.2 (-0.7 to 0.2); 0.0 (-0.4 to 0.4) (class 2)</w:t>
+            </w:r>
+          </w:p>
+        </w:tc>
+      </w:tr>
+      <w:tr>
+        <w:tc>
+          <w:tcPr/>
+          <w:p>
+            <w:pPr>
+              <w:pStyle w:val="Compact"/>
+              <w:jc w:val="left"/>
+            </w:pPr>
+            <w:r>
+              <w:t xml:space="preserve">schedule: extended schedule minus confirmed</w:t>
+            </w:r>
+          </w:p>
+        </w:tc>
+        <w:tc>
+          <w:tcPr/>
+          <w:p>
+            <w:pPr>
+              <w:pStyle w:val="Compact"/>
+              <w:jc w:val="left"/>
+            </w:pPr>
+            <w:r>
+              <w:t xml:space="preserve">AUROC (10% F difference)</w:t>
+            </w:r>
+          </w:p>
+        </w:tc>
+        <w:tc>
+          <w:tcPr/>
+          <w:p>
+            <w:pPr>
+              <w:pStyle w:val="Compact"/>
+              <w:jc w:val="left"/>
+            </w:pPr>
+            <w:r>
+              <w:t xml:space="preserve">-0.001 (-0.003 to 0.002)</w:t>
+            </w:r>
+          </w:p>
+        </w:tc>
+        <w:tc>
+          <w:tcPr/>
+          <w:p>
+            <w:pPr>
+              <w:pStyle w:val="Compact"/>
+              <w:jc w:val="left"/>
+            </w:pPr>
+            <w:r>
+              <w:t xml:space="preserve">0.000 (-0.001 to 0.002)</w:t>
+            </w:r>
+          </w:p>
+        </w:tc>
+        <w:tc>
+          <w:tcPr/>
+          <w:p>
+            <w:pPr>
+              <w:pStyle w:val="Compact"/>
+              <w:jc w:val="left"/>
+            </w:pPr>
+            <w:r>
               <w:t xml:space="preserve">2, no material effect in either model</w:t>
             </w:r>
           </w:p>
         </w:tc>
+        <w:tc>
+          <w:tcPr/>
+          <w:p>
+            <w:pPr>
+              <w:pStyle w:val="Compact"/>
+              <w:jc w:val="left"/>
+            </w:pPr>
+            <w:r>
+              <w:t xml:space="preserve">0.004 (0.000 to 0.007); 0.002 (0.000 to 0.004) (class 2)</w:t>
+            </w:r>
+          </w:p>
+        </w:tc>
       </w:tr>
       <w:tr>
         <w:tc>
@@ -4043,6 +3970,524 @@
               <w:jc w:val="left"/>
             </w:pPr>
             <w:r>
+              <w:t xml:space="preserve">F lower 50% crossing (pp)</w:t>
+            </w:r>
+          </w:p>
+        </w:tc>
+        <w:tc>
+          <w:tcPr/>
+          <w:p>
+            <w:pPr>
+              <w:pStyle w:val="Compact"/>
+              <w:jc w:val="left"/>
+            </w:pPr>
+            <w:r>
+              <w:t xml:space="preserve">0.0 (0.0 to 0.0)</w:t>
+            </w:r>
+          </w:p>
+        </w:tc>
+        <w:tc>
+          <w:tcPr/>
+          <w:p>
+            <w:pPr>
+              <w:pStyle w:val="Compact"/>
+              <w:jc w:val="left"/>
+            </w:pPr>
+            <w:r>
+              <w:t xml:space="preserve">0.0 (0.0 to 0.0)</w:t>
+            </w:r>
+          </w:p>
+        </w:tc>
+        <w:tc>
+          <w:tcPr/>
+          <w:p>
+            <w:pPr>
+              <w:pStyle w:val="Compact"/>
+              <w:jc w:val="left"/>
+            </w:pPr>
+            <w:r>
+              <w:t xml:space="preserve">2, no material effect in either model</w:t>
+            </w:r>
+          </w:p>
+        </w:tc>
+        <w:tc>
+          <w:tcPr/>
+          <w:p>
+            <w:pPr>
+              <w:pStyle w:val="Compact"/>
+              <w:jc w:val="left"/>
+            </w:pPr>
+            <w:r>
+              <w:t xml:space="preserve">0.0 (0.0 to 0.0); 0.0 (0.0 to 0.0) (class 2)</w:t>
+            </w:r>
+          </w:p>
+        </w:tc>
+      </w:tr>
+      <w:tr>
+        <w:tc>
+          <w:tcPr/>
+          <w:p>
+            <w:pPr>
+              <w:pStyle w:val="Compact"/>
+              <w:jc w:val="left"/>
+            </w:pPr>
+            <w:r>
+              <w:t xml:space="preserve">schedule: extended schedule minus confirmed</w:t>
+            </w:r>
+          </w:p>
+        </w:tc>
+        <w:tc>
+          <w:tcPr/>
+          <w:p>
+            <w:pPr>
+              <w:pStyle w:val="Compact"/>
+              <w:jc w:val="left"/>
+            </w:pPr>
+            <w:r>
+              <w:t xml:space="preserve">F upper 50% crossing (pp)</w:t>
+            </w:r>
+          </w:p>
+        </w:tc>
+        <w:tc>
+          <w:tcPr/>
+          <w:p>
+            <w:pPr>
+              <w:pStyle w:val="Compact"/>
+              <w:jc w:val="left"/>
+            </w:pPr>
+            <w:r>
+              <w:t xml:space="preserve">0.0 (-0.1 to 0.0)</w:t>
+            </w:r>
+          </w:p>
+        </w:tc>
+        <w:tc>
+          <w:tcPr/>
+          <w:p>
+            <w:pPr>
+              <w:pStyle w:val="Compact"/>
+              <w:jc w:val="left"/>
+            </w:pPr>
+            <w:r>
+              <w:t xml:space="preserve">0.0 (0.0 to 0.0)</w:t>
+            </w:r>
+          </w:p>
+        </w:tc>
+        <w:tc>
+          <w:tcPr/>
+          <w:p>
+            <w:pPr>
+              <w:pStyle w:val="Compact"/>
+              <w:jc w:val="left"/>
+            </w:pPr>
+            <w:r>
+              <w:t xml:space="preserve">2, no material effect in either model</w:t>
+            </w:r>
+          </w:p>
+        </w:tc>
+        <w:tc>
+          <w:tcPr/>
+          <w:p>
+            <w:pPr>
+              <w:pStyle w:val="Compact"/>
+              <w:jc w:val="left"/>
+            </w:pPr>
+            <w:r>
+              <w:t xml:space="preserve">-0.1 (-0.1 to 0.0); 0.0 (-0.1 to 0.0) (class 2)</w:t>
+            </w:r>
+          </w:p>
+        </w:tc>
+      </w:tr>
+      <w:tr>
+        <w:tc>
+          <w:tcPr/>
+          <w:p>
+            <w:pPr>
+              <w:pStyle w:val="Compact"/>
+              <w:jc w:val="left"/>
+            </w:pPr>
+            <w:r>
+              <w:t xml:space="preserve">schedule: extended schedule minus confirmed</w:t>
+            </w:r>
+          </w:p>
+        </w:tc>
+        <w:tc>
+          <w:tcPr/>
+          <w:p>
+            <w:pPr>
+              <w:pStyle w:val="Compact"/>
+              <w:jc w:val="left"/>
+            </w:pPr>
+            <w:r>
+              <w:t xml:space="preserve">lambda_z success (pp)</w:t>
+            </w:r>
+          </w:p>
+        </w:tc>
+        <w:tc>
+          <w:tcPr/>
+          <w:p>
+            <w:pPr>
+              <w:pStyle w:val="Compact"/>
+              <w:jc w:val="left"/>
+            </w:pPr>
+            <w:r>
+              <w:t xml:space="preserve">0.0 (0.0 to 0.1)</w:t>
+            </w:r>
+          </w:p>
+        </w:tc>
+        <w:tc>
+          <w:tcPr/>
+          <w:p>
+            <w:pPr>
+              <w:pStyle w:val="Compact"/>
+              <w:jc w:val="left"/>
+            </w:pPr>
+            <w:r>
+              <w:t xml:space="preserve">0.0 (0.0 to 0.1)</w:t>
+            </w:r>
+          </w:p>
+        </w:tc>
+        <w:tc>
+          <w:tcPr/>
+          <w:p>
+            <w:pPr>
+              <w:pStyle w:val="Compact"/>
+              <w:jc w:val="left"/>
+            </w:pPr>
+            <w:r>
+              <w:t xml:space="preserve">2, no material effect in either model</w:t>
+            </w:r>
+          </w:p>
+        </w:tc>
+        <w:tc>
+          <w:tcPr/>
+          <w:p>
+            <w:pPr>
+              <w:pStyle w:val="Compact"/>
+              <w:jc w:val="left"/>
+            </w:pPr>
+            <w:r>
+              <w:t xml:space="preserve">0.1 (0.0 to 0.1); 0.1 (0.0 to 0.1) (class 2)</w:t>
+            </w:r>
+          </w:p>
+        </w:tc>
+      </w:tr>
+      <w:tr>
+        <w:tc>
+          <w:tcPr/>
+          <w:p>
+            <w:pPr>
+              <w:pStyle w:val="Compact"/>
+              <w:jc w:val="left"/>
+            </w:pPr>
+            <w:r>
+              <w:t xml:space="preserve">schedule: extended schedule minus confirmed</w:t>
+            </w:r>
+          </w:p>
+        </w:tc>
+        <w:tc>
+          <w:tcPr/>
+          <w:p>
+            <w:pPr>
+              <w:pStyle w:val="Compact"/>
+              <w:jc w:val="left"/>
+            </w:pPr>
+            <w:r>
+              <w:t xml:space="preserve">reliable-terminal-phase share (pp)</w:t>
+            </w:r>
+          </w:p>
+        </w:tc>
+        <w:tc>
+          <w:tcPr/>
+          <w:p>
+            <w:pPr>
+              <w:pStyle w:val="Compact"/>
+              <w:jc w:val="left"/>
+            </w:pPr>
+            <w:r>
+              <w:t xml:space="preserve">0.4 (0.3 to 0.5)</w:t>
+            </w:r>
+          </w:p>
+        </w:tc>
+        <w:tc>
+          <w:tcPr/>
+          <w:p>
+            <w:pPr>
+              <w:pStyle w:val="Compact"/>
+              <w:jc w:val="left"/>
+            </w:pPr>
+            <w:r>
+              <w:t xml:space="preserve">0.2 (0.1 to 0.2)</w:t>
+            </w:r>
+          </w:p>
+        </w:tc>
+        <w:tc>
+          <w:tcPr/>
+          <w:p>
+            <w:pPr>
+              <w:pStyle w:val="Compact"/>
+              <w:jc w:val="left"/>
+            </w:pPr>
+            <w:r>
+              <w:t xml:space="preserve">2, no material effect in either model</w:t>
+            </w:r>
+          </w:p>
+        </w:tc>
+        <w:tc>
+          <w:tcPr/>
+          <w:p>
+            <w:pPr>
+              <w:pStyle w:val="Compact"/>
+              <w:jc w:val="left"/>
+            </w:pPr>
+            <w:r>
+              <w:t xml:space="preserve">0.7 (0.6 to 0.9); 0.3 (0.2 to 0.4) (class 2)</w:t>
+            </w:r>
+          </w:p>
+        </w:tc>
+      </w:tr>
+      <w:tr>
+        <w:tc>
+          <w:tcPr/>
+          <w:p>
+            <w:pPr>
+              <w:pStyle w:val="Compact"/>
+              <w:jc w:val="left"/>
+            </w:pPr>
+            <w:r>
+              <w:t xml:space="preserve">schedule: extended schedule minus confirmed</w:t>
+            </w:r>
+          </w:p>
+        </w:tc>
+        <w:tc>
+          <w:tcPr/>
+          <w:p>
+            <w:pPr>
+              <w:pStyle w:val="Compact"/>
+              <w:jc w:val="left"/>
+            </w:pPr>
+            <w:r>
+              <w:t xml:space="preserve">median AUC0-last error (pp)</w:t>
+            </w:r>
+          </w:p>
+        </w:tc>
+        <w:tc>
+          <w:tcPr/>
+          <w:p>
+            <w:pPr>
+              <w:pStyle w:val="Compact"/>
+              <w:jc w:val="left"/>
+            </w:pPr>
+            <w:r>
+              <w:t xml:space="preserve">0.0 (0.0 to 0.0)</w:t>
+            </w:r>
+          </w:p>
+        </w:tc>
+        <w:tc>
+          <w:tcPr/>
+          <w:p>
+            <w:pPr>
+              <w:pStyle w:val="Compact"/>
+              <w:jc w:val="left"/>
+            </w:pPr>
+            <w:r>
+              <w:t xml:space="preserve">0.0 (0.0 to 0.0)</w:t>
+            </w:r>
+          </w:p>
+        </w:tc>
+        <w:tc>
+          <w:tcPr/>
+          <w:p>
+            <w:pPr>
+              <w:pStyle w:val="Compact"/>
+              <w:jc w:val="left"/>
+            </w:pPr>
+            <w:r>
+              <w:t xml:space="preserve">2, no material effect in either model</w:t>
+            </w:r>
+          </w:p>
+        </w:tc>
+        <w:tc>
+          <w:tcPr/>
+          <w:p>
+            <w:pPr>
+              <w:pStyle w:val="Compact"/>
+              <w:jc w:val="left"/>
+            </w:pPr>
+            <w:r>
+              <w:t xml:space="preserve">0.0 (0.0 to 0.0); 0.0 (0.0 to 0.0) (class 2)</w:t>
+            </w:r>
+          </w:p>
+        </w:tc>
+      </w:tr>
+      <w:tr>
+        <w:tc>
+          <w:tcPr/>
+          <w:p>
+            <w:pPr>
+              <w:pStyle w:val="Compact"/>
+              <w:jc w:val="left"/>
+            </w:pPr>
+            <w:r>
+              <w:t xml:space="preserve">schedule: extended schedule minus confirmed</w:t>
+            </w:r>
+          </w:p>
+        </w:tc>
+        <w:tc>
+          <w:tcPr/>
+          <w:p>
+            <w:pPr>
+              <w:pStyle w:val="Compact"/>
+              <w:jc w:val="left"/>
+            </w:pPr>
+            <w:r>
+              <w:t xml:space="preserve">RMSE of the AUC0-last log ratio</w:t>
+            </w:r>
+          </w:p>
+        </w:tc>
+        <w:tc>
+          <w:tcPr/>
+          <w:p>
+            <w:pPr>
+              <w:pStyle w:val="Compact"/>
+              <w:jc w:val="left"/>
+            </w:pPr>
+            <w:r>
+              <w:t xml:space="preserve">0.000 (0.000 to 0.000)</w:t>
+            </w:r>
+          </w:p>
+        </w:tc>
+        <w:tc>
+          <w:tcPr/>
+          <w:p>
+            <w:pPr>
+              <w:pStyle w:val="Compact"/>
+              <w:jc w:val="left"/>
+            </w:pPr>
+            <w:r>
+              <w:t xml:space="preserve">0.000 (0.000 to 0.000)</w:t>
+            </w:r>
+          </w:p>
+        </w:tc>
+        <w:tc>
+          <w:tcPr/>
+          <w:p>
+            <w:pPr>
+              <w:pStyle w:val="Compact"/>
+              <w:jc w:val="left"/>
+            </w:pPr>
+            <w:r>
+              <w:t xml:space="preserve">2, no material effect in either model</w:t>
+            </w:r>
+          </w:p>
+        </w:tc>
+        <w:tc>
+          <w:tcPr/>
+          <w:p>
+            <w:pPr>
+              <w:pStyle w:val="Compact"/>
+              <w:jc w:val="left"/>
+            </w:pPr>
+            <w:r>
+              <w:t xml:space="preserve">0.000 (0.000 to 0.000); 0.000 (0.000 to 0.000) (class 2)</w:t>
+            </w:r>
+          </w:p>
+        </w:tc>
+      </w:tr>
+      <w:tr>
+        <w:tc>
+          <w:tcPr/>
+          <w:p>
+            <w:pPr>
+              <w:pStyle w:val="Compact"/>
+              <w:jc w:val="left"/>
+            </w:pPr>
+            <w:r>
+              <w:t xml:space="preserve">schedule: reduced schedule minus confirmed</w:t>
+            </w:r>
+          </w:p>
+        </w:tc>
+        <w:tc>
+          <w:tcPr/>
+          <w:p>
+            <w:pPr>
+              <w:pStyle w:val="Compact"/>
+              <w:jc w:val="left"/>
+            </w:pPr>
+            <w:r>
+              <w:t xml:space="preserve">power at true GMR 0.95 (pp)</w:t>
+            </w:r>
+          </w:p>
+        </w:tc>
+        <w:tc>
+          <w:tcPr/>
+          <w:p>
+            <w:pPr>
+              <w:pStyle w:val="Compact"/>
+              <w:jc w:val="left"/>
+            </w:pPr>
+            <w:r>
+              <w:t xml:space="preserve">2.0 (1.3 to 3.1)</w:t>
+            </w:r>
+          </w:p>
+        </w:tc>
+        <w:tc>
+          <w:tcPr/>
+          <w:p>
+            <w:pPr>
+              <w:pStyle w:val="Compact"/>
+              <w:jc w:val="left"/>
+            </w:pPr>
+            <w:r>
+              <w:t xml:space="preserve">2.3 (1.5 to 3.4)</w:t>
+            </w:r>
+          </w:p>
+        </w:tc>
+        <w:tc>
+          <w:tcPr/>
+          <w:p>
+            <w:pPr>
+              <w:pStyle w:val="Compact"/>
+              <w:jc w:val="left"/>
+            </w:pPr>
+            <w:r>
+              <w:t xml:space="preserve">1, same direction</w:t>
+            </w:r>
+          </w:p>
+        </w:tc>
+        <w:tc>
+          <w:tcPr/>
+          <w:p>
+            <w:pPr>
+              <w:pStyle w:val="Compact"/>
+              <w:jc w:val="left"/>
+            </w:pPr>
+            <w:r>
+              <w:t xml:space="preserve">3.1 (2.2 to 4.4); 1.1 (0.6 to 2.0) (class 3)</w:t>
+            </w:r>
+          </w:p>
+        </w:tc>
+      </w:tr>
+      <w:tr>
+        <w:tc>
+          <w:tcPr/>
+          <w:p>
+            <w:pPr>
+              <w:pStyle w:val="Compact"/>
+              <w:jc w:val="left"/>
+            </w:pPr>
+            <w:r>
+              <w:t xml:space="preserve">schedule: reduced schedule minus confirmed</w:t>
+            </w:r>
+          </w:p>
+        </w:tc>
+        <w:tc>
+          <w:tcPr/>
+          <w:p>
+            <w:pPr>
+              <w:pStyle w:val="Compact"/>
+              <w:jc w:val="left"/>
+            </w:pPr>
+            <w:r>
               <w:t xml:space="preserve">AUROC (10% F difference)</w:t>
             </w:r>
           </w:p>
@@ -4055,19 +4500,93 @@
               <w:jc w:val="left"/>
             </w:pPr>
             <w:r>
-              <w:t xml:space="preserve">-0.001, 95% CI -0.003 to 0.002</w:t>
-            </w:r>
-          </w:p>
-        </w:tc>
-        <w:tc>
-          <w:tcPr/>
-          <w:p>
-            <w:pPr>
-              <w:pStyle w:val="Compact"/>
-              <w:jc w:val="left"/>
-            </w:pPr>
-            <w:r>
-              <w:t xml:space="preserve">0.000, 95% CI -0.001 to 0.002</w:t>
+              <w:t xml:space="preserve">-0.105 (-0.120 to -0.089)</w:t>
+            </w:r>
+          </w:p>
+        </w:tc>
+        <w:tc>
+          <w:tcPr/>
+          <w:p>
+            <w:pPr>
+              <w:pStyle w:val="Compact"/>
+              <w:jc w:val="left"/>
+            </w:pPr>
+            <w:r>
+              <w:t xml:space="preserve">-0.064 (-0.075 to -0.052)</w:t>
+            </w:r>
+          </w:p>
+        </w:tc>
+        <w:tc>
+          <w:tcPr/>
+          <w:p>
+            <w:pPr>
+              <w:pStyle w:val="Compact"/>
+              <w:jc w:val="left"/>
+            </w:pPr>
+            <w:r>
+              <w:t xml:space="preserve">1, same direction</w:t>
+            </w:r>
+          </w:p>
+        </w:tc>
+        <w:tc>
+          <w:tcPr/>
+          <w:p>
+            <w:pPr>
+              <w:pStyle w:val="Compact"/>
+              <w:jc w:val="left"/>
+            </w:pPr>
+            <w:r>
+              <w:t xml:space="preserve">-0.089 (-0.104 to -0.076); -0.077 (-0.089 to -0.064) (class 1)</w:t>
+            </w:r>
+          </w:p>
+        </w:tc>
+      </w:tr>
+      <w:tr>
+        <w:tc>
+          <w:tcPr/>
+          <w:p>
+            <w:pPr>
+              <w:pStyle w:val="Compact"/>
+              <w:jc w:val="left"/>
+            </w:pPr>
+            <w:r>
+              <w:t xml:space="preserve">schedule: reduced schedule minus confirmed</w:t>
+            </w:r>
+          </w:p>
+        </w:tc>
+        <w:tc>
+          <w:tcPr/>
+          <w:p>
+            <w:pPr>
+              <w:pStyle w:val="Compact"/>
+              <w:jc w:val="left"/>
+            </w:pPr>
+            <w:r>
+              <w:t xml:space="preserve">F lower 50% crossing (pp)</w:t>
+            </w:r>
+          </w:p>
+        </w:tc>
+        <w:tc>
+          <w:tcPr/>
+          <w:p>
+            <w:pPr>
+              <w:pStyle w:val="Compact"/>
+              <w:jc w:val="left"/>
+            </w:pPr>
+            <w:r>
+              <w:t xml:space="preserve">-1.0 (-1.1 to -0.9)</w:t>
+            </w:r>
+          </w:p>
+        </w:tc>
+        <w:tc>
+          <w:tcPr/>
+          <w:p>
+            <w:pPr>
+              <w:pStyle w:val="Compact"/>
+              <w:jc w:val="left"/>
+            </w:pPr>
+            <w:r>
+              <w:t xml:space="preserve">-0.9 (-1.1 to -0.8)</w:t>
             </w:r>
           </w:p>
         </w:tc>
@@ -4091,57 +4610,427 @@
               <w:jc w:val="left"/>
             </w:pPr>
             <w:r>
+              <w:t xml:space="preserve">-1.2 (-1.4 to -1.1); -1.3 (-1.5 to -1.1) (class 2)</w:t>
+            </w:r>
+          </w:p>
+        </w:tc>
+      </w:tr>
+      <w:tr>
+        <w:tc>
+          <w:tcPr/>
+          <w:p>
+            <w:pPr>
+              <w:pStyle w:val="Compact"/>
+              <w:jc w:val="left"/>
+            </w:pPr>
+            <w:r>
+              <w:t xml:space="preserve">schedule: reduced schedule minus confirmed</w:t>
+            </w:r>
+          </w:p>
+        </w:tc>
+        <w:tc>
+          <w:tcPr/>
+          <w:p>
+            <w:pPr>
+              <w:pStyle w:val="Compact"/>
+              <w:jc w:val="left"/>
+            </w:pPr>
+            <w:r>
+              <w:t xml:space="preserve">F upper 50% crossing (pp)</w:t>
+            </w:r>
+          </w:p>
+        </w:tc>
+        <w:tc>
+          <w:tcPr/>
+          <w:p>
+            <w:pPr>
+              <w:pStyle w:val="Compact"/>
+              <w:jc w:val="left"/>
+            </w:pPr>
+            <w:r>
+              <w:t xml:space="preserve">1.6 (1.4 to 1.9)</w:t>
+            </w:r>
+          </w:p>
+        </w:tc>
+        <w:tc>
+          <w:tcPr/>
+          <w:p>
+            <w:pPr>
+              <w:pStyle w:val="Compact"/>
+              <w:jc w:val="left"/>
+            </w:pPr>
+            <w:r>
+              <w:t xml:space="preserve">1.8 (1.6 to 2.0)</w:t>
+            </w:r>
+          </w:p>
+        </w:tc>
+        <w:tc>
+          <w:tcPr/>
+          <w:p>
+            <w:pPr>
+              <w:pStyle w:val="Compact"/>
+              <w:jc w:val="left"/>
+            </w:pPr>
+            <w:r>
               <w:t xml:space="preserve">2, no material effect in either model</w:t>
             </w:r>
           </w:p>
         </w:tc>
-      </w:tr>
-      <w:tr>
-        <w:tc>
-          <w:tcPr/>
-          <w:p>
-            <w:pPr>
-              <w:pStyle w:val="Compact"/>
-              <w:jc w:val="left"/>
-            </w:pPr>
-            <w:r>
-              <w:t xml:space="preserve">schedule: extended schedule minus confirmed</w:t>
-            </w:r>
-          </w:p>
-        </w:tc>
-        <w:tc>
-          <w:tcPr/>
-          <w:p>
-            <w:pPr>
-              <w:pStyle w:val="Compact"/>
-              <w:jc w:val="left"/>
-            </w:pPr>
-            <w:r>
-              <w:t xml:space="preserve">F lower 50% crossing</w:t>
-            </w:r>
-          </w:p>
-        </w:tc>
-        <w:tc>
-          <w:tcPr/>
-          <w:p>
-            <w:pPr>
-              <w:pStyle w:val="Compact"/>
-              <w:jc w:val="left"/>
-            </w:pPr>
-            <w:r>
-              <w:t xml:space="preserve">0.0 pp, 95% CI 0.0 to 0.0</w:t>
-            </w:r>
-          </w:p>
-        </w:tc>
-        <w:tc>
-          <w:tcPr/>
-          <w:p>
-            <w:pPr>
-              <w:pStyle w:val="Compact"/>
-              <w:jc w:val="left"/>
-            </w:pPr>
-            <w:r>
-              <w:t xml:space="preserve">0.0 pp, 95% CI 0.0 to 0.0</w:t>
+        <w:tc>
+          <w:tcPr/>
+          <w:p>
+            <w:pPr>
+              <w:pStyle w:val="Compact"/>
+              <w:jc w:val="left"/>
+            </w:pPr>
+            <w:r>
+              <w:t xml:space="preserve">1.3 (1.1 to 1.5); 1.5 (1.3 to 1.7) (class 2)</w:t>
+            </w:r>
+          </w:p>
+        </w:tc>
+      </w:tr>
+      <w:tr>
+        <w:tc>
+          <w:tcPr/>
+          <w:p>
+            <w:pPr>
+              <w:pStyle w:val="Compact"/>
+              <w:jc w:val="left"/>
+            </w:pPr>
+            <w:r>
+              <w:t xml:space="preserve">schedule: reduced schedule minus confirmed</w:t>
+            </w:r>
+          </w:p>
+        </w:tc>
+        <w:tc>
+          <w:tcPr/>
+          <w:p>
+            <w:pPr>
+              <w:pStyle w:val="Compact"/>
+              <w:jc w:val="left"/>
+            </w:pPr>
+            <w:r>
+              <w:t xml:space="preserve">lambda_z success (pp)</w:t>
+            </w:r>
+          </w:p>
+        </w:tc>
+        <w:tc>
+          <w:tcPr/>
+          <w:p>
+            <w:pPr>
+              <w:pStyle w:val="Compact"/>
+              <w:jc w:val="left"/>
+            </w:pPr>
+            <w:r>
+              <w:t xml:space="preserve">-38.1 (-38.7 to -37.4)</w:t>
+            </w:r>
+          </w:p>
+        </w:tc>
+        <w:tc>
+          <w:tcPr/>
+          <w:p>
+            <w:pPr>
+              <w:pStyle w:val="Compact"/>
+              <w:jc w:val="left"/>
+            </w:pPr>
+            <w:r>
+              <w:t xml:space="preserve">-27.4 (-28.0 to -26.7)</w:t>
+            </w:r>
+          </w:p>
+        </w:tc>
+        <w:tc>
+          <w:tcPr/>
+          <w:p>
+            <w:pPr>
+              <w:pStyle w:val="Compact"/>
+              <w:jc w:val="left"/>
+            </w:pPr>
+            <w:r>
+              <w:t xml:space="preserve">1, same direction</w:t>
+            </w:r>
+          </w:p>
+        </w:tc>
+        <w:tc>
+          <w:tcPr/>
+          <w:p>
+            <w:pPr>
+              <w:pStyle w:val="Compact"/>
+              <w:jc w:val="left"/>
+            </w:pPr>
+            <w:r>
+              <w:t xml:space="preserve">-42.6 (-43.3 to -41.9); -31.8 (-32.4 to -31.2) (class 1)</w:t>
+            </w:r>
+          </w:p>
+        </w:tc>
+      </w:tr>
+      <w:tr>
+        <w:tc>
+          <w:tcPr/>
+          <w:p>
+            <w:pPr>
+              <w:pStyle w:val="Compact"/>
+              <w:jc w:val="left"/>
+            </w:pPr>
+            <w:r>
+              <w:t xml:space="preserve">schedule: reduced schedule minus confirmed</w:t>
+            </w:r>
+          </w:p>
+        </w:tc>
+        <w:tc>
+          <w:tcPr/>
+          <w:p>
+            <w:pPr>
+              <w:pStyle w:val="Compact"/>
+              <w:jc w:val="left"/>
+            </w:pPr>
+            <w:r>
+              <w:t xml:space="preserve">reliable-terminal-phase share (pp)</w:t>
+            </w:r>
+          </w:p>
+        </w:tc>
+        <w:tc>
+          <w:tcPr/>
+          <w:p>
+            <w:pPr>
+              <w:pStyle w:val="Compact"/>
+              <w:jc w:val="left"/>
+            </w:pPr>
+            <w:r>
+              <w:t xml:space="preserve">-47.0 (-47.7 to -46.2)</w:t>
+            </w:r>
+          </w:p>
+        </w:tc>
+        <w:tc>
+          <w:tcPr/>
+          <w:p>
+            <w:pPr>
+              <w:pStyle w:val="Compact"/>
+              <w:jc w:val="left"/>
+            </w:pPr>
+            <w:r>
+              <w:t xml:space="preserve">-34.5 (-35.3 to -33.8)</w:t>
+            </w:r>
+          </w:p>
+        </w:tc>
+        <w:tc>
+          <w:tcPr/>
+          <w:p>
+            <w:pPr>
+              <w:pStyle w:val="Compact"/>
+              <w:jc w:val="left"/>
+            </w:pPr>
+            <w:r>
+              <w:t xml:space="preserve">1, same direction</w:t>
+            </w:r>
+          </w:p>
+        </w:tc>
+        <w:tc>
+          <w:tcPr/>
+          <w:p>
+            <w:pPr>
+              <w:pStyle w:val="Compact"/>
+              <w:jc w:val="left"/>
+            </w:pPr>
+            <w:r>
+              <w:t xml:space="preserve">-51.9 (-52.7 to -51.1); -39.6 (-40.4 to -38.9) (class 1)</w:t>
+            </w:r>
+          </w:p>
+        </w:tc>
+      </w:tr>
+      <w:tr>
+        <w:tc>
+          <w:tcPr/>
+          <w:p>
+            <w:pPr>
+              <w:pStyle w:val="Compact"/>
+              <w:jc w:val="left"/>
+            </w:pPr>
+            <w:r>
+              <w:t xml:space="preserve">schedule: reduced schedule minus confirmed</w:t>
+            </w:r>
+          </w:p>
+        </w:tc>
+        <w:tc>
+          <w:tcPr/>
+          <w:p>
+            <w:pPr>
+              <w:pStyle w:val="Compact"/>
+              <w:jc w:val="left"/>
+            </w:pPr>
+            <w:r>
+              <w:t xml:space="preserve">median AUC0-last error (pp)</w:t>
+            </w:r>
+          </w:p>
+        </w:tc>
+        <w:tc>
+          <w:tcPr/>
+          <w:p>
+            <w:pPr>
+              <w:pStyle w:val="Compact"/>
+              <w:jc w:val="left"/>
+            </w:pPr>
+            <w:r>
+              <w:t xml:space="preserve">-6.4 (-6.5 to -6.3)</w:t>
+            </w:r>
+          </w:p>
+        </w:tc>
+        <w:tc>
+          <w:tcPr/>
+          <w:p>
+            <w:pPr>
+              <w:pStyle w:val="Compact"/>
+              <w:jc w:val="left"/>
+            </w:pPr>
+            <w:r>
+              <w:t xml:space="preserve">-5.0 (-5.2 to -4.9)</w:t>
+            </w:r>
+          </w:p>
+        </w:tc>
+        <w:tc>
+          <w:tcPr/>
+          <w:p>
+            <w:pPr>
+              <w:pStyle w:val="Compact"/>
+              <w:jc w:val="left"/>
+            </w:pPr>
+            <w:r>
+              <w:t xml:space="preserve">1, same direction</w:t>
+            </w:r>
+          </w:p>
+        </w:tc>
+        <w:tc>
+          <w:tcPr/>
+          <w:p>
+            <w:pPr>
+              <w:pStyle w:val="Compact"/>
+              <w:jc w:val="left"/>
+            </w:pPr>
+            <w:r>
+              <w:t xml:space="preserve">-7.6 (-7.7 to -7.4); -6.2 (-6.3 to -6.0) (class 1)</w:t>
+            </w:r>
+          </w:p>
+        </w:tc>
+      </w:tr>
+      <w:tr>
+        <w:tc>
+          <w:tcPr/>
+          <w:p>
+            <w:pPr>
+              <w:pStyle w:val="Compact"/>
+              <w:jc w:val="left"/>
+            </w:pPr>
+            <w:r>
+              <w:t xml:space="preserve">schedule: reduced schedule minus confirmed</w:t>
+            </w:r>
+          </w:p>
+        </w:tc>
+        <w:tc>
+          <w:tcPr/>
+          <w:p>
+            <w:pPr>
+              <w:pStyle w:val="Compact"/>
+              <w:jc w:val="left"/>
+            </w:pPr>
+            <w:r>
+              <w:t xml:space="preserve">RMSE of the AUC0-last log ratio</w:t>
+            </w:r>
+          </w:p>
+        </w:tc>
+        <w:tc>
+          <w:tcPr/>
+          <w:p>
+            <w:pPr>
+              <w:pStyle w:val="Compact"/>
+              <w:jc w:val="left"/>
+            </w:pPr>
+            <w:r>
+              <w:t xml:space="preserve">0.072 (0.071 to 0.073)</w:t>
+            </w:r>
+          </w:p>
+        </w:tc>
+        <w:tc>
+          <w:tcPr/>
+          <w:p>
+            <w:pPr>
+              <w:pStyle w:val="Compact"/>
+              <w:jc w:val="left"/>
+            </w:pPr>
+            <w:r>
+              <w:t xml:space="preserve">0.047 (0.046 to 0.048)</w:t>
+            </w:r>
+          </w:p>
+        </w:tc>
+        <w:tc>
+          <w:tcPr/>
+          <w:p>
+            <w:pPr>
+              <w:pStyle w:val="Compact"/>
+              <w:jc w:val="left"/>
+            </w:pPr>
+            <w:r>
+              <w:t xml:space="preserve">1, same direction</w:t>
+            </w:r>
+          </w:p>
+        </w:tc>
+        <w:tc>
+          <w:tcPr/>
+          <w:p>
+            <w:pPr>
+              <w:pStyle w:val="Compact"/>
+              <w:jc w:val="left"/>
+            </w:pPr>
+            <w:r>
+              <w:t xml:space="preserve">0.083 (0.082 to 0.084); 0.057 (0.056 to 0.059) (class 1)</w:t>
+            </w:r>
+          </w:p>
+        </w:tc>
+      </w:tr>
+      <w:tr>
+        <w:tc>
+          <w:tcPr/>
+          <w:p>
+            <w:pPr>
+              <w:pStyle w:val="Compact"/>
+              <w:jc w:val="left"/>
+            </w:pPr>
+            <w:r>
+              <w:t xml:space="preserve">stratification: stratified minus unstratified analysis</w:t>
+            </w:r>
+          </w:p>
+        </w:tc>
+        <w:tc>
+          <w:tcPr/>
+          <w:p>
+            <w:pPr>
+              <w:pStyle w:val="Compact"/>
+              <w:jc w:val="left"/>
+            </w:pPr>
+            <w:r>
+              <w:t xml:space="preserve">power at true GMR 0.95 (pp)</w:t>
+            </w:r>
+          </w:p>
+        </w:tc>
+        <w:tc>
+          <w:tcPr/>
+          <w:p>
+            <w:pPr>
+              <w:pStyle w:val="Compact"/>
+              <w:jc w:val="left"/>
+            </w:pPr>
+            <w:r>
+              <w:t xml:space="preserve">0.7 (0.3 to 1.4)</w:t>
+            </w:r>
+          </w:p>
+        </w:tc>
+        <w:tc>
+          <w:tcPr/>
+          <w:p>
+            <w:pPr>
+              <w:pStyle w:val="Compact"/>
+              <w:jc w:val="left"/>
+            </w:pPr>
+            <w:r>
+              <w:t xml:space="preserve">0.2 (-0.3 to 0.8)</w:t>
             </w:r>
           </w:p>
         </w:tc>
@@ -4165,57 +5054,131 @@
               <w:jc w:val="left"/>
             </w:pPr>
             <w:r>
+              <w:t xml:space="preserve">0.1 (-0.5 to 0.8); 0.0 (-0.5 to 0.5) (class 2)</w:t>
+            </w:r>
+          </w:p>
+        </w:tc>
+      </w:tr>
+      <w:tr>
+        <w:tc>
+          <w:tcPr/>
+          <w:p>
+            <w:pPr>
+              <w:pStyle w:val="Compact"/>
+              <w:jc w:val="left"/>
+            </w:pPr>
+            <w:r>
+              <w:t xml:space="preserve">stratification: median minus 75 kg boundary</w:t>
+            </w:r>
+          </w:p>
+        </w:tc>
+        <w:tc>
+          <w:tcPr/>
+          <w:p>
+            <w:pPr>
+              <w:pStyle w:val="Compact"/>
+              <w:jc w:val="left"/>
+            </w:pPr>
+            <w:r>
+              <w:t xml:space="preserve">power at true GMR 0.95 (pp)</w:t>
+            </w:r>
+          </w:p>
+        </w:tc>
+        <w:tc>
+          <w:tcPr/>
+          <w:p>
+            <w:pPr>
+              <w:pStyle w:val="Compact"/>
+              <w:jc w:val="left"/>
+            </w:pPr>
+            <w:r>
+              <w:t xml:space="preserve">-0.5 (-2.3 to 1.3)</w:t>
+            </w:r>
+          </w:p>
+        </w:tc>
+        <w:tc>
+          <w:tcPr/>
+          <w:p>
+            <w:pPr>
+              <w:pStyle w:val="Compact"/>
+              <w:jc w:val="left"/>
+            </w:pPr>
+            <w:r>
+              <w:t xml:space="preserve">0.0 (-1.6 to 1.6)</w:t>
+            </w:r>
+          </w:p>
+        </w:tc>
+        <w:tc>
+          <w:tcPr/>
+          <w:p>
+            <w:pPr>
+              <w:pStyle w:val="Compact"/>
+              <w:jc w:val="left"/>
+            </w:pPr>
+            <w:r>
               <w:t xml:space="preserve">2, no material effect in either model</w:t>
             </w:r>
           </w:p>
         </w:tc>
-      </w:tr>
-      <w:tr>
-        <w:tc>
-          <w:tcPr/>
-          <w:p>
-            <w:pPr>
-              <w:pStyle w:val="Compact"/>
-              <w:jc w:val="left"/>
-            </w:pPr>
-            <w:r>
-              <w:t xml:space="preserve">schedule: extended schedule minus confirmed</w:t>
-            </w:r>
-          </w:p>
-        </w:tc>
-        <w:tc>
-          <w:tcPr/>
-          <w:p>
-            <w:pPr>
-              <w:pStyle w:val="Compact"/>
-              <w:jc w:val="left"/>
-            </w:pPr>
-            <w:r>
-              <w:t xml:space="preserve">F upper 50% crossing</w:t>
-            </w:r>
-          </w:p>
-        </w:tc>
-        <w:tc>
-          <w:tcPr/>
-          <w:p>
-            <w:pPr>
-              <w:pStyle w:val="Compact"/>
-              <w:jc w:val="left"/>
-            </w:pPr>
-            <w:r>
-              <w:t xml:space="preserve">0.0 pp, 95% CI -0.1 to 0.0</w:t>
-            </w:r>
-          </w:p>
-        </w:tc>
-        <w:tc>
-          <w:tcPr/>
-          <w:p>
-            <w:pPr>
-              <w:pStyle w:val="Compact"/>
-              <w:jc w:val="left"/>
-            </w:pPr>
-            <w:r>
-              <w:t xml:space="preserve">0.0 pp, 95% CI 0.0 to 0.0</w:t>
+        <w:tc>
+          <w:tcPr/>
+          <w:p>
+            <w:pPr>
+              <w:pStyle w:val="Compact"/>
+              <w:jc w:val="left"/>
+            </w:pPr>
+            <w:r>
+              <w:t xml:space="preserve">0.6 (-1.2 to 2.4); -0.4 (-1.9 to 1.1) (class 2)</w:t>
+            </w:r>
+          </w:p>
+        </w:tc>
+      </w:tr>
+      <w:tr>
+        <w:tc>
+          <w:tcPr/>
+          <w:p>
+            <w:pPr>
+              <w:pStyle w:val="Compact"/>
+              <w:jc w:val="left"/>
+            </w:pPr>
+            <w:r>
+              <w:t xml:space="preserve">population: Korean minus global</w:t>
+            </w:r>
+          </w:p>
+        </w:tc>
+        <w:tc>
+          <w:tcPr/>
+          <w:p>
+            <w:pPr>
+              <w:pStyle w:val="Compact"/>
+              <w:jc w:val="left"/>
+            </w:pPr>
+            <w:r>
+              <w:t xml:space="preserve">power at true GMR 0.95 (pp)</w:t>
+            </w:r>
+          </w:p>
+        </w:tc>
+        <w:tc>
+          <w:tcPr/>
+          <w:p>
+            <w:pPr>
+              <w:pStyle w:val="Compact"/>
+              <w:jc w:val="left"/>
+            </w:pPr>
+            <w:r>
+              <w:t xml:space="preserve">-0.5 (-2.3 to 1.3)</w:t>
+            </w:r>
+          </w:p>
+        </w:tc>
+        <w:tc>
+          <w:tcPr/>
+          <w:p>
+            <w:pPr>
+              <w:pStyle w:val="Compact"/>
+              <w:jc w:val="left"/>
+            </w:pPr>
+            <w:r>
+              <w:t xml:space="preserve">0.9 (-0.6 to 2.4)</w:t>
             </w:r>
           </w:p>
         </w:tc>
@@ -4239,57 +5202,131 @@
               <w:jc w:val="left"/>
             </w:pPr>
             <w:r>
+              <w:t xml:space="preserve">-</w:t>
+            </w:r>
+          </w:p>
+        </w:tc>
+      </w:tr>
+      <w:tr>
+        <w:tc>
+          <w:tcPr/>
+          <w:p>
+            <w:pPr>
+              <w:pStyle w:val="Compact"/>
+              <w:jc w:val="left"/>
+            </w:pPr>
+            <w:r>
+              <w:t xml:space="preserve">population: Korean minus global</w:t>
+            </w:r>
+          </w:p>
+        </w:tc>
+        <w:tc>
+          <w:tcPr/>
+          <w:p>
+            <w:pPr>
+              <w:pStyle w:val="Compact"/>
+              <w:jc w:val="left"/>
+            </w:pPr>
+            <w:r>
+              <w:t xml:space="preserve">AUROC (10% F difference)</w:t>
+            </w:r>
+          </w:p>
+        </w:tc>
+        <w:tc>
+          <w:tcPr/>
+          <w:p>
+            <w:pPr>
+              <w:pStyle w:val="Compact"/>
+              <w:jc w:val="left"/>
+            </w:pPr>
+            <w:r>
+              <w:t xml:space="preserve">-0.009 (-0.020 to 0.003)</w:t>
+            </w:r>
+          </w:p>
+        </w:tc>
+        <w:tc>
+          <w:tcPr/>
+          <w:p>
+            <w:pPr>
+              <w:pStyle w:val="Compact"/>
+              <w:jc w:val="left"/>
+            </w:pPr>
+            <w:r>
+              <w:t xml:space="preserve">-0.003 (-0.013 to 0.008)</w:t>
+            </w:r>
+          </w:p>
+        </w:tc>
+        <w:tc>
+          <w:tcPr/>
+          <w:p>
+            <w:pPr>
+              <w:pStyle w:val="Compact"/>
+              <w:jc w:val="left"/>
+            </w:pPr>
+            <w:r>
               <w:t xml:space="preserve">2, no material effect in either model</w:t>
             </w:r>
           </w:p>
         </w:tc>
-      </w:tr>
-      <w:tr>
-        <w:tc>
-          <w:tcPr/>
-          <w:p>
-            <w:pPr>
-              <w:pStyle w:val="Compact"/>
-              <w:jc w:val="left"/>
-            </w:pPr>
-            <w:r>
-              <w:t xml:space="preserve">schedule: extended schedule minus confirmed</w:t>
-            </w:r>
-          </w:p>
-        </w:tc>
-        <w:tc>
-          <w:tcPr/>
-          <w:p>
-            <w:pPr>
-              <w:pStyle w:val="Compact"/>
-              <w:jc w:val="left"/>
-            </w:pPr>
-            <w:r>
-              <w:t xml:space="preserve">lambda_z success</w:t>
-            </w:r>
-          </w:p>
-        </w:tc>
-        <w:tc>
-          <w:tcPr/>
-          <w:p>
-            <w:pPr>
-              <w:pStyle w:val="Compact"/>
-              <w:jc w:val="left"/>
-            </w:pPr>
-            <w:r>
-              <w:t xml:space="preserve">0.0 pp, 95% CI 0.0 to 0.1</w:t>
-            </w:r>
-          </w:p>
-        </w:tc>
-        <w:tc>
-          <w:tcPr/>
-          <w:p>
-            <w:pPr>
-              <w:pStyle w:val="Compact"/>
-              <w:jc w:val="left"/>
-            </w:pPr>
-            <w:r>
-              <w:t xml:space="preserve">0.0 pp, 95% CI 0.0 to 0.1</w:t>
+        <w:tc>
+          <w:tcPr/>
+          <w:p>
+            <w:pPr>
+              <w:pStyle w:val="Compact"/>
+              <w:jc w:val="left"/>
+            </w:pPr>
+            <w:r>
+              <w:t xml:space="preserve">-</w:t>
+            </w:r>
+          </w:p>
+        </w:tc>
+      </w:tr>
+      <w:tr>
+        <w:tc>
+          <w:tcPr/>
+          <w:p>
+            <w:pPr>
+              <w:pStyle w:val="Compact"/>
+              <w:jc w:val="left"/>
+            </w:pPr>
+            <w:r>
+              <w:t xml:space="preserve">population: Korean minus global</w:t>
+            </w:r>
+          </w:p>
+        </w:tc>
+        <w:tc>
+          <w:tcPr/>
+          <w:p>
+            <w:pPr>
+              <w:pStyle w:val="Compact"/>
+              <w:jc w:val="left"/>
+            </w:pPr>
+            <w:r>
+              <w:t xml:space="preserve">F lower 50% crossing (pp)</w:t>
+            </w:r>
+          </w:p>
+        </w:tc>
+        <w:tc>
+          <w:tcPr/>
+          <w:p>
+            <w:pPr>
+              <w:pStyle w:val="Compact"/>
+              <w:jc w:val="left"/>
+            </w:pPr>
+            <w:r>
+              <w:t xml:space="preserve">-0.2 (-0.3 to 0.0)</w:t>
+            </w:r>
+          </w:p>
+        </w:tc>
+        <w:tc>
+          <w:tcPr/>
+          <w:p>
+            <w:pPr>
+              <w:pStyle w:val="Compact"/>
+              <w:jc w:val="left"/>
+            </w:pPr>
+            <w:r>
+              <w:t xml:space="preserve">-0.2 (-0.3 to 0.0)</w:t>
             </w:r>
           </w:p>
         </w:tc>
@@ -4313,57 +5350,131 @@
               <w:jc w:val="left"/>
             </w:pPr>
             <w:r>
+              <w:t xml:space="preserve">-</w:t>
+            </w:r>
+          </w:p>
+        </w:tc>
+      </w:tr>
+      <w:tr>
+        <w:tc>
+          <w:tcPr/>
+          <w:p>
+            <w:pPr>
+              <w:pStyle w:val="Compact"/>
+              <w:jc w:val="left"/>
+            </w:pPr>
+            <w:r>
+              <w:t xml:space="preserve">population: Korean minus global</w:t>
+            </w:r>
+          </w:p>
+        </w:tc>
+        <w:tc>
+          <w:tcPr/>
+          <w:p>
+            <w:pPr>
+              <w:pStyle w:val="Compact"/>
+              <w:jc w:val="left"/>
+            </w:pPr>
+            <w:r>
+              <w:t xml:space="preserve">F upper 50% crossing (pp)</w:t>
+            </w:r>
+          </w:p>
+        </w:tc>
+        <w:tc>
+          <w:tcPr/>
+          <w:p>
+            <w:pPr>
+              <w:pStyle w:val="Compact"/>
+              <w:jc w:val="left"/>
+            </w:pPr>
+            <w:r>
+              <w:t xml:space="preserve">0.5 (0.2 to 0.8)</w:t>
+            </w:r>
+          </w:p>
+        </w:tc>
+        <w:tc>
+          <w:tcPr/>
+          <w:p>
+            <w:pPr>
+              <w:pStyle w:val="Compact"/>
+              <w:jc w:val="left"/>
+            </w:pPr>
+            <w:r>
+              <w:t xml:space="preserve">0.5 (0.1 to 0.8)</w:t>
+            </w:r>
+          </w:p>
+        </w:tc>
+        <w:tc>
+          <w:tcPr/>
+          <w:p>
+            <w:pPr>
+              <w:pStyle w:val="Compact"/>
+              <w:jc w:val="left"/>
+            </w:pPr>
+            <w:r>
               <w:t xml:space="preserve">2, no material effect in either model</w:t>
             </w:r>
           </w:p>
         </w:tc>
-      </w:tr>
-      <w:tr>
-        <w:tc>
-          <w:tcPr/>
-          <w:p>
-            <w:pPr>
-              <w:pStyle w:val="Compact"/>
-              <w:jc w:val="left"/>
-            </w:pPr>
-            <w:r>
-              <w:t xml:space="preserve">schedule: extended schedule minus confirmed</w:t>
-            </w:r>
-          </w:p>
-        </w:tc>
-        <w:tc>
-          <w:tcPr/>
-          <w:p>
-            <w:pPr>
-              <w:pStyle w:val="Compact"/>
-              <w:jc w:val="left"/>
-            </w:pPr>
-            <w:r>
-              <w:t xml:space="preserve">reliable-terminal-phase share</w:t>
-            </w:r>
-          </w:p>
-        </w:tc>
-        <w:tc>
-          <w:tcPr/>
-          <w:p>
-            <w:pPr>
-              <w:pStyle w:val="Compact"/>
-              <w:jc w:val="left"/>
-            </w:pPr>
-            <w:r>
-              <w:t xml:space="preserve">0.4 pp, 95% CI 0.3 to 0.5</w:t>
-            </w:r>
-          </w:p>
-        </w:tc>
-        <w:tc>
-          <w:tcPr/>
-          <w:p>
-            <w:pPr>
-              <w:pStyle w:val="Compact"/>
-              <w:jc w:val="left"/>
-            </w:pPr>
-            <w:r>
-              <w:t xml:space="preserve">0.2 pp, 95% CI 0.1 to 0.2</w:t>
+        <w:tc>
+          <w:tcPr/>
+          <w:p>
+            <w:pPr>
+              <w:pStyle w:val="Compact"/>
+              <w:jc w:val="left"/>
+            </w:pPr>
+            <w:r>
+              <w:t xml:space="preserve">-</w:t>
+            </w:r>
+          </w:p>
+        </w:tc>
+      </w:tr>
+      <w:tr>
+        <w:tc>
+          <w:tcPr/>
+          <w:p>
+            <w:pPr>
+              <w:pStyle w:val="Compact"/>
+              <w:jc w:val="left"/>
+            </w:pPr>
+            <w:r>
+              <w:t xml:space="preserve">population: Korean minus global</w:t>
+            </w:r>
+          </w:p>
+        </w:tc>
+        <w:tc>
+          <w:tcPr/>
+          <w:p>
+            <w:pPr>
+              <w:pStyle w:val="Compact"/>
+              <w:jc w:val="left"/>
+            </w:pPr>
+            <w:r>
+              <w:t xml:space="preserve">ke lower 50% crossing (pp)</w:t>
+            </w:r>
+          </w:p>
+        </w:tc>
+        <w:tc>
+          <w:tcPr/>
+          <w:p>
+            <w:pPr>
+              <w:pStyle w:val="Compact"/>
+              <w:jc w:val="left"/>
+            </w:pPr>
+            <w:r>
+              <w:t xml:space="preserve">0.2 (-0.4 to 0.9)</w:t>
+            </w:r>
+          </w:p>
+        </w:tc>
+        <w:tc>
+          <w:tcPr/>
+          <w:p>
+            <w:pPr>
+              <w:pStyle w:val="Compact"/>
+              <w:jc w:val="left"/>
+            </w:pPr>
+            <w:r>
+              <w:t xml:space="preserve">0.4 (-0.1 to 0.9)</w:t>
             </w:r>
           </w:p>
         </w:tc>
@@ -4387,217 +5498,131 @@
               <w:jc w:val="left"/>
             </w:pPr>
             <w:r>
+              <w:t xml:space="preserve">-</w:t>
+            </w:r>
+          </w:p>
+        </w:tc>
+      </w:tr>
+      <w:tr>
+        <w:tc>
+          <w:tcPr/>
+          <w:p>
+            <w:pPr>
+              <w:pStyle w:val="Compact"/>
+              <w:jc w:val="left"/>
+            </w:pPr>
+            <w:r>
+              <w:t xml:space="preserve">population: Korean minus global</w:t>
+            </w:r>
+          </w:p>
+        </w:tc>
+        <w:tc>
+          <w:tcPr/>
+          <w:p>
+            <w:pPr>
+              <w:pStyle w:val="Compact"/>
+              <w:jc w:val="left"/>
+            </w:pPr>
+            <w:r>
+              <w:t xml:space="preserve">ke upper 50% crossing (pp)</w:t>
+            </w:r>
+          </w:p>
+        </w:tc>
+        <w:tc>
+          <w:tcPr/>
+          <w:p>
+            <w:pPr>
+              <w:pStyle w:val="Compact"/>
+              <w:jc w:val="left"/>
+            </w:pPr>
+            <w:r>
+              <w:t xml:space="preserve">-0.9 (-1.7 to -0.1)</w:t>
+            </w:r>
+          </w:p>
+        </w:tc>
+        <w:tc>
+          <w:tcPr/>
+          <w:p>
+            <w:pPr>
+              <w:pStyle w:val="Compact"/>
+              <w:jc w:val="left"/>
+            </w:pPr>
+            <w:r>
+              <w:t xml:space="preserve">-1.0 (-1.8 to -0.2)</w:t>
+            </w:r>
+          </w:p>
+        </w:tc>
+        <w:tc>
+          <w:tcPr/>
+          <w:p>
+            <w:pPr>
+              <w:pStyle w:val="Compact"/>
+              <w:jc w:val="left"/>
+            </w:pPr>
+            <w:r>
               <w:t xml:space="preserve">2, no material effect in either model</w:t>
             </w:r>
           </w:p>
         </w:tc>
-      </w:tr>
-      <w:tr>
-        <w:tc>
-          <w:tcPr/>
-          <w:p>
-            <w:pPr>
-              <w:pStyle w:val="Compact"/>
-              <w:jc w:val="left"/>
-            </w:pPr>
-            <w:r>
-              <w:t xml:space="preserve">schedule: extended schedule minus confirmed</w:t>
-            </w:r>
-          </w:p>
-        </w:tc>
-        <w:tc>
-          <w:tcPr/>
-          <w:p>
-            <w:pPr>
-              <w:pStyle w:val="Compact"/>
-              <w:jc w:val="left"/>
-            </w:pPr>
-            <w:r>
-              <w:t xml:space="preserve">median AUC0-last error</w:t>
-            </w:r>
-          </w:p>
-        </w:tc>
-        <w:tc>
-          <w:tcPr/>
-          <w:p>
-            <w:pPr>
-              <w:pStyle w:val="Compact"/>
-              <w:jc w:val="left"/>
-            </w:pPr>
-            <w:r>
-              <w:t xml:space="preserve">0.0 pp, 95% CI 0.0 to 0.0</w:t>
-            </w:r>
-          </w:p>
-        </w:tc>
-        <w:tc>
-          <w:tcPr/>
-          <w:p>
-            <w:pPr>
-              <w:pStyle w:val="Compact"/>
-              <w:jc w:val="left"/>
-            </w:pPr>
-            <w:r>
-              <w:t xml:space="preserve">0.0 pp, 95% CI 0.0 to 0.0</w:t>
-            </w:r>
-          </w:p>
-        </w:tc>
-        <w:tc>
-          <w:tcPr/>
-          <w:p>
-            <w:pPr>
-              <w:pStyle w:val="Compact"/>
-              <w:jc w:val="left"/>
-            </w:pPr>
-            <w:r>
-              <w:t xml:space="preserve">2, no material effect in either model</w:t>
-            </w:r>
-          </w:p>
-        </w:tc>
-        <w:tc>
-          <w:tcPr/>
-          <w:p>
-            <w:pPr>
-              <w:pStyle w:val="Compact"/>
-              <w:jc w:val="left"/>
-            </w:pPr>
-            <w:r>
-              <w:t xml:space="preserve">2, no material effect in either model</w:t>
-            </w:r>
-          </w:p>
-        </w:tc>
-      </w:tr>
-      <w:tr>
-        <w:tc>
-          <w:tcPr/>
-          <w:p>
-            <w:pPr>
-              <w:pStyle w:val="Compact"/>
-              <w:jc w:val="left"/>
-            </w:pPr>
-            <w:r>
-              <w:t xml:space="preserve">schedule: extended schedule minus confirmed</w:t>
-            </w:r>
-          </w:p>
-        </w:tc>
-        <w:tc>
-          <w:tcPr/>
-          <w:p>
-            <w:pPr>
-              <w:pStyle w:val="Compact"/>
-              <w:jc w:val="left"/>
-            </w:pPr>
-            <w:r>
-              <w:t xml:space="preserve">RMSE of the AUC0-last log ratio</w:t>
-            </w:r>
-          </w:p>
-        </w:tc>
-        <w:tc>
-          <w:tcPr/>
-          <w:p>
-            <w:pPr>
-              <w:pStyle w:val="Compact"/>
-              <w:jc w:val="left"/>
-            </w:pPr>
-            <w:r>
-              <w:t xml:space="preserve">0.000, 95% CI 0.000 to 0.000</w:t>
-            </w:r>
-          </w:p>
-        </w:tc>
-        <w:tc>
-          <w:tcPr/>
-          <w:p>
-            <w:pPr>
-              <w:pStyle w:val="Compact"/>
-              <w:jc w:val="left"/>
-            </w:pPr>
-            <w:r>
-              <w:t xml:space="preserve">0.000, 95% CI 0.000 to 0.000</w:t>
-            </w:r>
-          </w:p>
-        </w:tc>
-        <w:tc>
-          <w:tcPr/>
-          <w:p>
-            <w:pPr>
-              <w:pStyle w:val="Compact"/>
-              <w:jc w:val="left"/>
-            </w:pPr>
-            <w:r>
-              <w:t xml:space="preserve">2, no material effect in either model</w:t>
-            </w:r>
-          </w:p>
-        </w:tc>
-        <w:tc>
-          <w:tcPr/>
-          <w:p>
-            <w:pPr>
-              <w:pStyle w:val="Compact"/>
-              <w:jc w:val="left"/>
-            </w:pPr>
-            <w:r>
-              <w:t xml:space="preserve">2, no material effect in either model</w:t>
-            </w:r>
-          </w:p>
-        </w:tc>
-      </w:tr>
-      <w:tr>
-        <w:tc>
-          <w:tcPr/>
-          <w:p>
-            <w:pPr>
-              <w:pStyle w:val="Compact"/>
-              <w:jc w:val="left"/>
-            </w:pPr>
-            <w:r>
-              <w:t xml:space="preserve">schedule: reduced schedule minus confirmed</w:t>
-            </w:r>
-          </w:p>
-        </w:tc>
-        <w:tc>
-          <w:tcPr/>
-          <w:p>
-            <w:pPr>
-              <w:pStyle w:val="Compact"/>
-              <w:jc w:val="left"/>
-            </w:pPr>
-            <w:r>
-              <w:t xml:space="preserve">power at true GMR 0.95</w:t>
-            </w:r>
-          </w:p>
-        </w:tc>
-        <w:tc>
-          <w:tcPr/>
-          <w:p>
-            <w:pPr>
-              <w:pStyle w:val="Compact"/>
-              <w:jc w:val="left"/>
-            </w:pPr>
-            <w:r>
-              <w:t xml:space="preserve">2.0 pp, 95% CI 1.3 to 3.1</w:t>
-            </w:r>
-          </w:p>
-        </w:tc>
-        <w:tc>
-          <w:tcPr/>
-          <w:p>
-            <w:pPr>
-              <w:pStyle w:val="Compact"/>
-              <w:jc w:val="left"/>
-            </w:pPr>
-            <w:r>
-              <w:t xml:space="preserve">2.3 pp, 95% CI 1.5 to 3.4</w:t>
-            </w:r>
-          </w:p>
-        </w:tc>
-        <w:tc>
-          <w:tcPr/>
-          <w:p>
-            <w:pPr>
-              <w:pStyle w:val="Compact"/>
-              <w:jc w:val="left"/>
-            </w:pPr>
-            <w:r>
-              <w:t xml:space="preserve">1, same direction</w:t>
+        <w:tc>
+          <w:tcPr/>
+          <w:p>
+            <w:pPr>
+              <w:pStyle w:val="Compact"/>
+              <w:jc w:val="left"/>
+            </w:pPr>
+            <w:r>
+              <w:t xml:space="preserve">-</w:t>
+            </w:r>
+          </w:p>
+        </w:tc>
+      </w:tr>
+      <w:tr>
+        <w:tc>
+          <w:tcPr/>
+          <w:p>
+            <w:pPr>
+              <w:pStyle w:val="Compact"/>
+              <w:jc w:val="left"/>
+            </w:pPr>
+            <w:r>
+              <w:t xml:space="preserve">population: Korean minus global</w:t>
+            </w:r>
+          </w:p>
+        </w:tc>
+        <w:tc>
+          <w:tcPr/>
+          <w:p>
+            <w:pPr>
+              <w:pStyle w:val="Compact"/>
+              <w:jc w:val="left"/>
+            </w:pPr>
+            <w:r>
+              <w:t xml:space="preserve">Vmax lower 50% crossing (pp)</w:t>
+            </w:r>
+          </w:p>
+        </w:tc>
+        <w:tc>
+          <w:tcPr/>
+          <w:p>
+            <w:pPr>
+              <w:pStyle w:val="Compact"/>
+              <w:jc w:val="left"/>
+            </w:pPr>
+            <w:r>
+              <w:t xml:space="preserve">-2.1 (-2.8 to -1.4)</w:t>
+            </w:r>
+          </w:p>
+        </w:tc>
+        <w:tc>
+          <w:tcPr/>
+          <w:p>
+            <w:pPr>
+              <w:pStyle w:val="Compact"/>
+              <w:jc w:val="left"/>
+            </w:pPr>
+            <w:r>
+              <w:t xml:space="preserve">-1.7 (-2.3 to -1.1)</w:t>
             </w:r>
           </w:p>
         </w:tc>
@@ -4613,669 +5638,15 @@
             </w:r>
           </w:p>
         </w:tc>
-      </w:tr>
-      <w:tr>
-        <w:tc>
-          <w:tcPr/>
-          <w:p>
-            <w:pPr>
-              <w:pStyle w:val="Compact"/>
-              <w:jc w:val="left"/>
-            </w:pPr>
-            <w:r>
-              <w:t xml:space="preserve">schedule: reduced schedule minus confirmed</w:t>
-            </w:r>
-          </w:p>
-        </w:tc>
-        <w:tc>
-          <w:tcPr/>
-          <w:p>
-            <w:pPr>
-              <w:pStyle w:val="Compact"/>
-              <w:jc w:val="left"/>
-            </w:pPr>
-            <w:r>
-              <w:t xml:space="preserve">AUROC (10% F difference)</w:t>
-            </w:r>
-          </w:p>
-        </w:tc>
-        <w:tc>
-          <w:tcPr/>
-          <w:p>
-            <w:pPr>
-              <w:pStyle w:val="Compact"/>
-              <w:jc w:val="left"/>
-            </w:pPr>
-            <w:r>
-              <w:t xml:space="preserve">-0.105, 95% CI -0.120 to -0.089</w:t>
-            </w:r>
-          </w:p>
-        </w:tc>
-        <w:tc>
-          <w:tcPr/>
-          <w:p>
-            <w:pPr>
-              <w:pStyle w:val="Compact"/>
-              <w:jc w:val="left"/>
-            </w:pPr>
-            <w:r>
-              <w:t xml:space="preserve">-0.064, 95% CI -0.075 to -0.052</w:t>
-            </w:r>
-          </w:p>
-        </w:tc>
-        <w:tc>
-          <w:tcPr/>
-          <w:p>
-            <w:pPr>
-              <w:pStyle w:val="Compact"/>
-              <w:jc w:val="left"/>
-            </w:pPr>
-            <w:r>
-              <w:t xml:space="preserve">1, same direction</w:t>
-            </w:r>
-          </w:p>
-        </w:tc>
-        <w:tc>
-          <w:tcPr/>
-          <w:p>
-            <w:pPr>
-              <w:pStyle w:val="Compact"/>
-              <w:jc w:val="left"/>
-            </w:pPr>
-            <w:r>
-              <w:t xml:space="preserve">1, same direction</w:t>
-            </w:r>
-          </w:p>
-        </w:tc>
-      </w:tr>
-      <w:tr>
-        <w:tc>
-          <w:tcPr/>
-          <w:p>
-            <w:pPr>
-              <w:pStyle w:val="Compact"/>
-              <w:jc w:val="left"/>
-            </w:pPr>
-            <w:r>
-              <w:t xml:space="preserve">schedule: reduced schedule minus confirmed</w:t>
-            </w:r>
-          </w:p>
-        </w:tc>
-        <w:tc>
-          <w:tcPr/>
-          <w:p>
-            <w:pPr>
-              <w:pStyle w:val="Compact"/>
-              <w:jc w:val="left"/>
-            </w:pPr>
-            <w:r>
-              <w:t xml:space="preserve">F lower 50% crossing</w:t>
-            </w:r>
-          </w:p>
-        </w:tc>
-        <w:tc>
-          <w:tcPr/>
-          <w:p>
-            <w:pPr>
-              <w:pStyle w:val="Compact"/>
-              <w:jc w:val="left"/>
-            </w:pPr>
-            <w:r>
-              <w:t xml:space="preserve">-1.0 pp, 95% CI -1.1 to -0.9</w:t>
-            </w:r>
-          </w:p>
-        </w:tc>
-        <w:tc>
-          <w:tcPr/>
-          <w:p>
-            <w:pPr>
-              <w:pStyle w:val="Compact"/>
-              <w:jc w:val="left"/>
-            </w:pPr>
-            <w:r>
-              <w:t xml:space="preserve">-0.9 pp, 95% CI -1.1 to -0.8</w:t>
-            </w:r>
-          </w:p>
-        </w:tc>
-        <w:tc>
-          <w:tcPr/>
-          <w:p>
-            <w:pPr>
-              <w:pStyle w:val="Compact"/>
-              <w:jc w:val="left"/>
-            </w:pPr>
-            <w:r>
-              <w:t xml:space="preserve">2, no material effect in either model</w:t>
-            </w:r>
-          </w:p>
-        </w:tc>
-        <w:tc>
-          <w:tcPr/>
-          <w:p>
-            <w:pPr>
-              <w:pStyle w:val="Compact"/>
-              <w:jc w:val="left"/>
-            </w:pPr>
-            <w:r>
-              <w:t xml:space="preserve">2, no material effect in either model</w:t>
-            </w:r>
-          </w:p>
-        </w:tc>
-      </w:tr>
-      <w:tr>
-        <w:tc>
-          <w:tcPr/>
-          <w:p>
-            <w:pPr>
-              <w:pStyle w:val="Compact"/>
-              <w:jc w:val="left"/>
-            </w:pPr>
-            <w:r>
-              <w:t xml:space="preserve">schedule: reduced schedule minus confirmed</w:t>
-            </w:r>
-          </w:p>
-        </w:tc>
-        <w:tc>
-          <w:tcPr/>
-          <w:p>
-            <w:pPr>
-              <w:pStyle w:val="Compact"/>
-              <w:jc w:val="left"/>
-            </w:pPr>
-            <w:r>
-              <w:t xml:space="preserve">F upper 50% crossing</w:t>
-            </w:r>
-          </w:p>
-        </w:tc>
-        <w:tc>
-          <w:tcPr/>
-          <w:p>
-            <w:pPr>
-              <w:pStyle w:val="Compact"/>
-              <w:jc w:val="left"/>
-            </w:pPr>
-            <w:r>
-              <w:t xml:space="preserve">1.6 pp, 95% CI 1.4 to 1.9</w:t>
-            </w:r>
-          </w:p>
-        </w:tc>
-        <w:tc>
-          <w:tcPr/>
-          <w:p>
-            <w:pPr>
-              <w:pStyle w:val="Compact"/>
-              <w:jc w:val="left"/>
-            </w:pPr>
-            <w:r>
-              <w:t xml:space="preserve">1.8 pp, 95% CI 1.6 to 2.0</w:t>
-            </w:r>
-          </w:p>
-        </w:tc>
-        <w:tc>
-          <w:tcPr/>
-          <w:p>
-            <w:pPr>
-              <w:pStyle w:val="Compact"/>
-              <w:jc w:val="left"/>
-            </w:pPr>
-            <w:r>
-              <w:t xml:space="preserve">2, no material effect in either model</w:t>
-            </w:r>
-          </w:p>
-        </w:tc>
-        <w:tc>
-          <w:tcPr/>
-          <w:p>
-            <w:pPr>
-              <w:pStyle w:val="Compact"/>
-              <w:jc w:val="left"/>
-            </w:pPr>
-            <w:r>
-              <w:t xml:space="preserve">2, no material effect in either model</w:t>
-            </w:r>
-          </w:p>
-        </w:tc>
-      </w:tr>
-      <w:tr>
-        <w:tc>
-          <w:tcPr/>
-          <w:p>
-            <w:pPr>
-              <w:pStyle w:val="Compact"/>
-              <w:jc w:val="left"/>
-            </w:pPr>
-            <w:r>
-              <w:t xml:space="preserve">schedule: reduced schedule minus confirmed</w:t>
-            </w:r>
-          </w:p>
-        </w:tc>
-        <w:tc>
-          <w:tcPr/>
-          <w:p>
-            <w:pPr>
-              <w:pStyle w:val="Compact"/>
-              <w:jc w:val="left"/>
-            </w:pPr>
-            <w:r>
-              <w:t xml:space="preserve">lambda_z success</w:t>
-            </w:r>
-          </w:p>
-        </w:tc>
-        <w:tc>
-          <w:tcPr/>
-          <w:p>
-            <w:pPr>
-              <w:pStyle w:val="Compact"/>
-              <w:jc w:val="left"/>
-            </w:pPr>
-            <w:r>
-              <w:t xml:space="preserve">-38.1 pp, 95% CI -38.7 to -37.4</w:t>
-            </w:r>
-          </w:p>
-        </w:tc>
-        <w:tc>
-          <w:tcPr/>
-          <w:p>
-            <w:pPr>
-              <w:pStyle w:val="Compact"/>
-              <w:jc w:val="left"/>
-            </w:pPr>
-            <w:r>
-              <w:t xml:space="preserve">-27.4 pp, 95% CI -28.0 to -26.7</w:t>
-            </w:r>
-          </w:p>
-        </w:tc>
-        <w:tc>
-          <w:tcPr/>
-          <w:p>
-            <w:pPr>
-              <w:pStyle w:val="Compact"/>
-              <w:jc w:val="left"/>
-            </w:pPr>
-            <w:r>
-              <w:t xml:space="preserve">1, same direction</w:t>
-            </w:r>
-          </w:p>
-        </w:tc>
-        <w:tc>
-          <w:tcPr/>
-          <w:p>
-            <w:pPr>
-              <w:pStyle w:val="Compact"/>
-              <w:jc w:val="left"/>
-            </w:pPr>
-            <w:r>
-              <w:t xml:space="preserve">1, same direction</w:t>
-            </w:r>
-          </w:p>
-        </w:tc>
-      </w:tr>
-      <w:tr>
-        <w:tc>
-          <w:tcPr/>
-          <w:p>
-            <w:pPr>
-              <w:pStyle w:val="Compact"/>
-              <w:jc w:val="left"/>
-            </w:pPr>
-            <w:r>
-              <w:t xml:space="preserve">schedule: reduced schedule minus confirmed</w:t>
-            </w:r>
-          </w:p>
-        </w:tc>
-        <w:tc>
-          <w:tcPr/>
-          <w:p>
-            <w:pPr>
-              <w:pStyle w:val="Compact"/>
-              <w:jc w:val="left"/>
-            </w:pPr>
-            <w:r>
-              <w:t xml:space="preserve">reliable-terminal-phase share</w:t>
-            </w:r>
-          </w:p>
-        </w:tc>
-        <w:tc>
-          <w:tcPr/>
-          <w:p>
-            <w:pPr>
-              <w:pStyle w:val="Compact"/>
-              <w:jc w:val="left"/>
-            </w:pPr>
-            <w:r>
-              <w:t xml:space="preserve">-47.0 pp, 95% CI -47.7 to -46.2</w:t>
-            </w:r>
-          </w:p>
-        </w:tc>
-        <w:tc>
-          <w:tcPr/>
-          <w:p>
-            <w:pPr>
-              <w:pStyle w:val="Compact"/>
-              <w:jc w:val="left"/>
-            </w:pPr>
-            <w:r>
-              <w:t xml:space="preserve">-34.5 pp, 95% CI -35.3 to -33.8</w:t>
-            </w:r>
-          </w:p>
-        </w:tc>
-        <w:tc>
-          <w:tcPr/>
-          <w:p>
-            <w:pPr>
-              <w:pStyle w:val="Compact"/>
-              <w:jc w:val="left"/>
-            </w:pPr>
-            <w:r>
-              <w:t xml:space="preserve">1, same direction</w:t>
-            </w:r>
-          </w:p>
-        </w:tc>
-        <w:tc>
-          <w:tcPr/>
-          <w:p>
-            <w:pPr>
-              <w:pStyle w:val="Compact"/>
-              <w:jc w:val="left"/>
-            </w:pPr>
-            <w:r>
-              <w:t xml:space="preserve">1, same direction</w:t>
-            </w:r>
-          </w:p>
-        </w:tc>
-      </w:tr>
-      <w:tr>
-        <w:tc>
-          <w:tcPr/>
-          <w:p>
-            <w:pPr>
-              <w:pStyle w:val="Compact"/>
-              <w:jc w:val="left"/>
-            </w:pPr>
-            <w:r>
-              <w:t xml:space="preserve">schedule: reduced schedule minus confirmed</w:t>
-            </w:r>
-          </w:p>
-        </w:tc>
-        <w:tc>
-          <w:tcPr/>
-          <w:p>
-            <w:pPr>
-              <w:pStyle w:val="Compact"/>
-              <w:jc w:val="left"/>
-            </w:pPr>
-            <w:r>
-              <w:t xml:space="preserve">median AUC0-last error</w:t>
-            </w:r>
-          </w:p>
-        </w:tc>
-        <w:tc>
-          <w:tcPr/>
-          <w:p>
-            <w:pPr>
-              <w:pStyle w:val="Compact"/>
-              <w:jc w:val="left"/>
-            </w:pPr>
-            <w:r>
-              <w:t xml:space="preserve">-6.4 pp, 95% CI -6.5 to -6.3</w:t>
-            </w:r>
-          </w:p>
-        </w:tc>
-        <w:tc>
-          <w:tcPr/>
-          <w:p>
-            <w:pPr>
-              <w:pStyle w:val="Compact"/>
-              <w:jc w:val="left"/>
-            </w:pPr>
-            <w:r>
-              <w:t xml:space="preserve">-5.0 pp, 95% CI -5.2 to -4.9</w:t>
-            </w:r>
-          </w:p>
-        </w:tc>
-        <w:tc>
-          <w:tcPr/>
-          <w:p>
-            <w:pPr>
-              <w:pStyle w:val="Compact"/>
-              <w:jc w:val="left"/>
-            </w:pPr>
-            <w:r>
-              <w:t xml:space="preserve">1, same direction</w:t>
-            </w:r>
-          </w:p>
-        </w:tc>
-        <w:tc>
-          <w:tcPr/>
-          <w:p>
-            <w:pPr>
-              <w:pStyle w:val="Compact"/>
-              <w:jc w:val="left"/>
-            </w:pPr>
-            <w:r>
-              <w:t xml:space="preserve">1, same direction</w:t>
-            </w:r>
-          </w:p>
-        </w:tc>
-      </w:tr>
-      <w:tr>
-        <w:tc>
-          <w:tcPr/>
-          <w:p>
-            <w:pPr>
-              <w:pStyle w:val="Compact"/>
-              <w:jc w:val="left"/>
-            </w:pPr>
-            <w:r>
-              <w:t xml:space="preserve">schedule: reduced schedule minus confirmed</w:t>
-            </w:r>
-          </w:p>
-        </w:tc>
-        <w:tc>
-          <w:tcPr/>
-          <w:p>
-            <w:pPr>
-              <w:pStyle w:val="Compact"/>
-              <w:jc w:val="left"/>
-            </w:pPr>
-            <w:r>
-              <w:t xml:space="preserve">RMSE of the AUC0-last log ratio</w:t>
-            </w:r>
-          </w:p>
-        </w:tc>
-        <w:tc>
-          <w:tcPr/>
-          <w:p>
-            <w:pPr>
-              <w:pStyle w:val="Compact"/>
-              <w:jc w:val="left"/>
-            </w:pPr>
-            <w:r>
-              <w:t xml:space="preserve">0.072, 95% CI 0.071 to 0.073</w:t>
-            </w:r>
-          </w:p>
-        </w:tc>
-        <w:tc>
-          <w:tcPr/>
-          <w:p>
-            <w:pPr>
-              <w:pStyle w:val="Compact"/>
-              <w:jc w:val="left"/>
-            </w:pPr>
-            <w:r>
-              <w:t xml:space="preserve">0.047, 95% CI 0.046 to 0.048</w:t>
-            </w:r>
-          </w:p>
-        </w:tc>
-        <w:tc>
-          <w:tcPr/>
-          <w:p>
-            <w:pPr>
-              <w:pStyle w:val="Compact"/>
-              <w:jc w:val="left"/>
-            </w:pPr>
-            <w:r>
-              <w:t xml:space="preserve">1, same direction</w:t>
-            </w:r>
-          </w:p>
-        </w:tc>
-        <w:tc>
-          <w:tcPr/>
-          <w:p>
-            <w:pPr>
-              <w:pStyle w:val="Compact"/>
-              <w:jc w:val="left"/>
-            </w:pPr>
-            <w:r>
-              <w:t xml:space="preserve">1, same direction</w:t>
-            </w:r>
-          </w:p>
-        </w:tc>
-      </w:tr>
-      <w:tr>
-        <w:tc>
-          <w:tcPr/>
-          <w:p>
-            <w:pPr>
-              <w:pStyle w:val="Compact"/>
-              <w:jc w:val="left"/>
-            </w:pPr>
-            <w:r>
-              <w:t xml:space="preserve">stratification: stratified minus unstratified analysis</w:t>
-            </w:r>
-          </w:p>
-        </w:tc>
-        <w:tc>
-          <w:tcPr/>
-          <w:p>
-            <w:pPr>
-              <w:pStyle w:val="Compact"/>
-              <w:jc w:val="left"/>
-            </w:pPr>
-            <w:r>
-              <w:t xml:space="preserve">power at true GMR 0.95</w:t>
-            </w:r>
-          </w:p>
-        </w:tc>
-        <w:tc>
-          <w:tcPr/>
-          <w:p>
-            <w:pPr>
-              <w:pStyle w:val="Compact"/>
-              <w:jc w:val="left"/>
-            </w:pPr>
-            <w:r>
-              <w:t xml:space="preserve">0.7 pp, 95% CI 0.3 to 1.4</w:t>
-            </w:r>
-          </w:p>
-        </w:tc>
-        <w:tc>
-          <w:tcPr/>
-          <w:p>
-            <w:pPr>
-              <w:pStyle w:val="Compact"/>
-              <w:jc w:val="left"/>
-            </w:pPr>
-            <w:r>
-              <w:t xml:space="preserve">0.2 pp, 95% CI -0.3 to 0.8</w:t>
-            </w:r>
-          </w:p>
-        </w:tc>
-        <w:tc>
-          <w:tcPr/>
-          <w:p>
-            <w:pPr>
-              <w:pStyle w:val="Compact"/>
-              <w:jc w:val="left"/>
-            </w:pPr>
-            <w:r>
-              <w:t xml:space="preserve">2, no material effect in either model</w:t>
-            </w:r>
-          </w:p>
-        </w:tc>
-        <w:tc>
-          <w:tcPr/>
-          <w:p>
-            <w:pPr>
-              <w:pStyle w:val="Compact"/>
-              <w:jc w:val="left"/>
-            </w:pPr>
-            <w:r>
-              <w:t xml:space="preserve">2, no material effect in either model</w:t>
-            </w:r>
-          </w:p>
-        </w:tc>
-      </w:tr>
-      <w:tr>
-        <w:tc>
-          <w:tcPr/>
-          <w:p>
-            <w:pPr>
-              <w:pStyle w:val="Compact"/>
-              <w:jc w:val="left"/>
-            </w:pPr>
-            <w:r>
-              <w:t xml:space="preserve">stratification: median minus 75 kg boundary</w:t>
-            </w:r>
-          </w:p>
-        </w:tc>
-        <w:tc>
-          <w:tcPr/>
-          <w:p>
-            <w:pPr>
-              <w:pStyle w:val="Compact"/>
-              <w:jc w:val="left"/>
-            </w:pPr>
-            <w:r>
-              <w:t xml:space="preserve">power at true GMR 0.95</w:t>
-            </w:r>
-          </w:p>
-        </w:tc>
-        <w:tc>
-          <w:tcPr/>
-          <w:p>
-            <w:pPr>
-              <w:pStyle w:val="Compact"/>
-              <w:jc w:val="left"/>
-            </w:pPr>
-            <w:r>
-              <w:t xml:space="preserve">-0.5 pp, 95% CI -2.3 to 1.3</w:t>
-            </w:r>
-          </w:p>
-        </w:tc>
-        <w:tc>
-          <w:tcPr/>
-          <w:p>
-            <w:pPr>
-              <w:pStyle w:val="Compact"/>
-              <w:jc w:val="left"/>
-            </w:pPr>
-            <w:r>
-              <w:t xml:space="preserve">0.0 pp, 95% CI -1.6 to 1.6</w:t>
-            </w:r>
-          </w:p>
-        </w:tc>
-        <w:tc>
-          <w:tcPr/>
-          <w:p>
-            <w:pPr>
-              <w:pStyle w:val="Compact"/>
-              <w:jc w:val="left"/>
-            </w:pPr>
-            <w:r>
-              <w:t xml:space="preserve">2, no material effect in either model</w:t>
-            </w:r>
-          </w:p>
-        </w:tc>
-        <w:tc>
-          <w:tcPr/>
-          <w:p>
-            <w:pPr>
-              <w:pStyle w:val="Compact"/>
-              <w:jc w:val="left"/>
-            </w:pPr>
-            <w:r>
-              <w:t xml:space="preserve">2, no material effect in either model</w:t>
+        <w:tc>
+          <w:tcPr/>
+          <w:p>
+            <w:pPr>
+              <w:pStyle w:val="Compact"/>
+              <w:jc w:val="left"/>
+            </w:pPr>
+            <w:r>
+              <w:t xml:space="preserve">-</w:t>
             </w:r>
           </w:p>
         </w:tc>
@@ -5301,549 +5672,31 @@
               <w:jc w:val="left"/>
             </w:pPr>
             <w:r>
-              <w:t xml:space="preserve">power at true GMR 0.95</w:t>
-            </w:r>
-          </w:p>
-        </w:tc>
-        <w:tc>
-          <w:tcPr/>
-          <w:p>
-            <w:pPr>
-              <w:pStyle w:val="Compact"/>
-              <w:jc w:val="left"/>
-            </w:pPr>
-            <w:r>
-              <w:t xml:space="preserve">-0.5 pp, 95% CI -2.3 to 1.3</w:t>
-            </w:r>
-          </w:p>
-        </w:tc>
-        <w:tc>
-          <w:tcPr/>
-          <w:p>
-            <w:pPr>
-              <w:pStyle w:val="Compact"/>
-              <w:jc w:val="left"/>
-            </w:pPr>
-            <w:r>
-              <w:t xml:space="preserve">0.9 pp, 95% CI -0.6 to 2.4</w:t>
-            </w:r>
-          </w:p>
-        </w:tc>
-        <w:tc>
-          <w:tcPr/>
-          <w:p>
-            <w:pPr>
-              <w:pStyle w:val="Compact"/>
-              <w:jc w:val="left"/>
-            </w:pPr>
-            <w:r>
-              <w:t xml:space="preserve">2, no material effect in either model</w:t>
-            </w:r>
-          </w:p>
-        </w:tc>
-        <w:tc>
-          <w:tcPr/>
-          <w:p>
-            <w:pPr>
-              <w:pStyle w:val="Compact"/>
-              <w:jc w:val="left"/>
-            </w:pPr>
-            <w:r>
-              <w:t xml:space="preserve">-</w:t>
-            </w:r>
-          </w:p>
-        </w:tc>
-      </w:tr>
-      <w:tr>
-        <w:tc>
-          <w:tcPr/>
-          <w:p>
-            <w:pPr>
-              <w:pStyle w:val="Compact"/>
-              <w:jc w:val="left"/>
-            </w:pPr>
-            <w:r>
-              <w:t xml:space="preserve">population: Korean minus global</w:t>
-            </w:r>
-          </w:p>
-        </w:tc>
-        <w:tc>
-          <w:tcPr/>
-          <w:p>
-            <w:pPr>
-              <w:pStyle w:val="Compact"/>
-              <w:jc w:val="left"/>
-            </w:pPr>
-            <w:r>
-              <w:t xml:space="preserve">AUROC (10% F difference)</w:t>
-            </w:r>
-          </w:p>
-        </w:tc>
-        <w:tc>
-          <w:tcPr/>
-          <w:p>
-            <w:pPr>
-              <w:pStyle w:val="Compact"/>
-              <w:jc w:val="left"/>
-            </w:pPr>
-            <w:r>
-              <w:t xml:space="preserve">-0.009, 95% CI -0.020 to 0.003</w:t>
-            </w:r>
-          </w:p>
-        </w:tc>
-        <w:tc>
-          <w:tcPr/>
-          <w:p>
-            <w:pPr>
-              <w:pStyle w:val="Compact"/>
-              <w:jc w:val="left"/>
-            </w:pPr>
-            <w:r>
-              <w:t xml:space="preserve">-0.003, 95% CI -0.013 to 0.008</w:t>
-            </w:r>
-          </w:p>
-        </w:tc>
-        <w:tc>
-          <w:tcPr/>
-          <w:p>
-            <w:pPr>
-              <w:pStyle w:val="Compact"/>
-              <w:jc w:val="left"/>
-            </w:pPr>
-            <w:r>
-              <w:t xml:space="preserve">2, no material effect in either model</w:t>
-            </w:r>
-          </w:p>
-        </w:tc>
-        <w:tc>
-          <w:tcPr/>
-          <w:p>
-            <w:pPr>
-              <w:pStyle w:val="Compact"/>
-              <w:jc w:val="left"/>
-            </w:pPr>
-            <w:r>
-              <w:t xml:space="preserve">-</w:t>
-            </w:r>
-          </w:p>
-        </w:tc>
-      </w:tr>
-      <w:tr>
-        <w:tc>
-          <w:tcPr/>
-          <w:p>
-            <w:pPr>
-              <w:pStyle w:val="Compact"/>
-              <w:jc w:val="left"/>
-            </w:pPr>
-            <w:r>
-              <w:t xml:space="preserve">population: Korean minus global</w:t>
-            </w:r>
-          </w:p>
-        </w:tc>
-        <w:tc>
-          <w:tcPr/>
-          <w:p>
-            <w:pPr>
-              <w:pStyle w:val="Compact"/>
-              <w:jc w:val="left"/>
-            </w:pPr>
-            <w:r>
-              <w:t xml:space="preserve">F lower 50% crossing</w:t>
-            </w:r>
-          </w:p>
-        </w:tc>
-        <w:tc>
-          <w:tcPr/>
-          <w:p>
-            <w:pPr>
-              <w:pStyle w:val="Compact"/>
-              <w:jc w:val="left"/>
-            </w:pPr>
-            <w:r>
-              <w:t xml:space="preserve">-0.2 pp, 95% CI -0.3 to 0.0</w:t>
-            </w:r>
-          </w:p>
-        </w:tc>
-        <w:tc>
-          <w:tcPr/>
-          <w:p>
-            <w:pPr>
-              <w:pStyle w:val="Compact"/>
-              <w:jc w:val="left"/>
-            </w:pPr>
-            <w:r>
-              <w:t xml:space="preserve">-0.2 pp, 95% CI -0.3 to 0.0</w:t>
-            </w:r>
-          </w:p>
-        </w:tc>
-        <w:tc>
-          <w:tcPr/>
-          <w:p>
-            <w:pPr>
-              <w:pStyle w:val="Compact"/>
-              <w:jc w:val="left"/>
-            </w:pPr>
-            <w:r>
-              <w:t xml:space="preserve">2, no material effect in either model</w:t>
-            </w:r>
-          </w:p>
-        </w:tc>
-        <w:tc>
-          <w:tcPr/>
-          <w:p>
-            <w:pPr>
-              <w:pStyle w:val="Compact"/>
-              <w:jc w:val="left"/>
-            </w:pPr>
-            <w:r>
-              <w:t xml:space="preserve">-</w:t>
-            </w:r>
-          </w:p>
-        </w:tc>
-      </w:tr>
-      <w:tr>
-        <w:tc>
-          <w:tcPr/>
-          <w:p>
-            <w:pPr>
-              <w:pStyle w:val="Compact"/>
-              <w:jc w:val="left"/>
-            </w:pPr>
-            <w:r>
-              <w:t xml:space="preserve">population: Korean minus global</w:t>
-            </w:r>
-          </w:p>
-        </w:tc>
-        <w:tc>
-          <w:tcPr/>
-          <w:p>
-            <w:pPr>
-              <w:pStyle w:val="Compact"/>
-              <w:jc w:val="left"/>
-            </w:pPr>
-            <w:r>
-              <w:t xml:space="preserve">F upper 50% crossing</w:t>
-            </w:r>
-          </w:p>
-        </w:tc>
-        <w:tc>
-          <w:tcPr/>
-          <w:p>
-            <w:pPr>
-              <w:pStyle w:val="Compact"/>
-              <w:jc w:val="left"/>
-            </w:pPr>
-            <w:r>
-              <w:t xml:space="preserve">0.5 pp, 95% CI 0.2 to 0.8</w:t>
-            </w:r>
-          </w:p>
-        </w:tc>
-        <w:tc>
-          <w:tcPr/>
-          <w:p>
-            <w:pPr>
-              <w:pStyle w:val="Compact"/>
-              <w:jc w:val="left"/>
-            </w:pPr>
-            <w:r>
-              <w:t xml:space="preserve">0.5 pp, 95% CI 0.1 to 0.8</w:t>
-            </w:r>
-          </w:p>
-        </w:tc>
-        <w:tc>
-          <w:tcPr/>
-          <w:p>
-            <w:pPr>
-              <w:pStyle w:val="Compact"/>
-              <w:jc w:val="left"/>
-            </w:pPr>
-            <w:r>
-              <w:t xml:space="preserve">2, no material effect in either model</w:t>
-            </w:r>
-          </w:p>
-        </w:tc>
-        <w:tc>
-          <w:tcPr/>
-          <w:p>
-            <w:pPr>
-              <w:pStyle w:val="Compact"/>
-              <w:jc w:val="left"/>
-            </w:pPr>
-            <w:r>
-              <w:t xml:space="preserve">-</w:t>
-            </w:r>
-          </w:p>
-        </w:tc>
-      </w:tr>
-      <w:tr>
-        <w:tc>
-          <w:tcPr/>
-          <w:p>
-            <w:pPr>
-              <w:pStyle w:val="Compact"/>
-              <w:jc w:val="left"/>
-            </w:pPr>
-            <w:r>
-              <w:t xml:space="preserve">population: Korean minus global</w:t>
-            </w:r>
-          </w:p>
-        </w:tc>
-        <w:tc>
-          <w:tcPr/>
-          <w:p>
-            <w:pPr>
-              <w:pStyle w:val="Compact"/>
-              <w:jc w:val="left"/>
-            </w:pPr>
-            <w:r>
-              <w:t xml:space="preserve">ke lower 50% crossing</w:t>
-            </w:r>
-          </w:p>
-        </w:tc>
-        <w:tc>
-          <w:tcPr/>
-          <w:p>
-            <w:pPr>
-              <w:pStyle w:val="Compact"/>
-              <w:jc w:val="left"/>
-            </w:pPr>
-            <w:r>
-              <w:t xml:space="preserve">0.2 pp, 95% CI -0.4 to 0.9</w:t>
-            </w:r>
-          </w:p>
-        </w:tc>
-        <w:tc>
-          <w:tcPr/>
-          <w:p>
-            <w:pPr>
-              <w:pStyle w:val="Compact"/>
-              <w:jc w:val="left"/>
-            </w:pPr>
-            <w:r>
-              <w:t xml:space="preserve">0.4 pp, 95% CI -0.1 to 0.9</w:t>
-            </w:r>
-          </w:p>
-        </w:tc>
-        <w:tc>
-          <w:tcPr/>
-          <w:p>
-            <w:pPr>
-              <w:pStyle w:val="Compact"/>
-              <w:jc w:val="left"/>
-            </w:pPr>
-            <w:r>
-              <w:t xml:space="preserve">2, no material effect in either model</w:t>
-            </w:r>
-          </w:p>
-        </w:tc>
-        <w:tc>
-          <w:tcPr/>
-          <w:p>
-            <w:pPr>
-              <w:pStyle w:val="Compact"/>
-              <w:jc w:val="left"/>
-            </w:pPr>
-            <w:r>
-              <w:t xml:space="preserve">-</w:t>
-            </w:r>
-          </w:p>
-        </w:tc>
-      </w:tr>
-      <w:tr>
-        <w:tc>
-          <w:tcPr/>
-          <w:p>
-            <w:pPr>
-              <w:pStyle w:val="Compact"/>
-              <w:jc w:val="left"/>
-            </w:pPr>
-            <w:r>
-              <w:t xml:space="preserve">population: Korean minus global</w:t>
-            </w:r>
-          </w:p>
-        </w:tc>
-        <w:tc>
-          <w:tcPr/>
-          <w:p>
-            <w:pPr>
-              <w:pStyle w:val="Compact"/>
-              <w:jc w:val="left"/>
-            </w:pPr>
-            <w:r>
-              <w:t xml:space="preserve">ke upper 50% crossing</w:t>
-            </w:r>
-          </w:p>
-        </w:tc>
-        <w:tc>
-          <w:tcPr/>
-          <w:p>
-            <w:pPr>
-              <w:pStyle w:val="Compact"/>
-              <w:jc w:val="left"/>
-            </w:pPr>
-            <w:r>
-              <w:t xml:space="preserve">-0.9 pp, 95% CI -1.7 to -0.1</w:t>
-            </w:r>
-          </w:p>
-        </w:tc>
-        <w:tc>
-          <w:tcPr/>
-          <w:p>
-            <w:pPr>
-              <w:pStyle w:val="Compact"/>
-              <w:jc w:val="left"/>
-            </w:pPr>
-            <w:r>
-              <w:t xml:space="preserve">-1.0 pp, 95% CI -1.8 to -0.2</w:t>
-            </w:r>
-          </w:p>
-        </w:tc>
-        <w:tc>
-          <w:tcPr/>
-          <w:p>
-            <w:pPr>
-              <w:pStyle w:val="Compact"/>
-              <w:jc w:val="left"/>
-            </w:pPr>
-            <w:r>
-              <w:t xml:space="preserve">2, no material effect in either model</w:t>
-            </w:r>
-          </w:p>
-        </w:tc>
-        <w:tc>
-          <w:tcPr/>
-          <w:p>
-            <w:pPr>
-              <w:pStyle w:val="Compact"/>
-              <w:jc w:val="left"/>
-            </w:pPr>
-            <w:r>
-              <w:t xml:space="preserve">-</w:t>
-            </w:r>
-          </w:p>
-        </w:tc>
-      </w:tr>
-      <w:tr>
-        <w:tc>
-          <w:tcPr/>
-          <w:p>
-            <w:pPr>
-              <w:pStyle w:val="Compact"/>
-              <w:jc w:val="left"/>
-            </w:pPr>
-            <w:r>
-              <w:t xml:space="preserve">population: Korean minus global</w:t>
-            </w:r>
-          </w:p>
-        </w:tc>
-        <w:tc>
-          <w:tcPr/>
-          <w:p>
-            <w:pPr>
-              <w:pStyle w:val="Compact"/>
-              <w:jc w:val="left"/>
-            </w:pPr>
-            <w:r>
-              <w:t xml:space="preserve">Vmax lower 50% crossing</w:t>
-            </w:r>
-          </w:p>
-        </w:tc>
-        <w:tc>
-          <w:tcPr/>
-          <w:p>
-            <w:pPr>
-              <w:pStyle w:val="Compact"/>
-              <w:jc w:val="left"/>
-            </w:pPr>
-            <w:r>
-              <w:t xml:space="preserve">-2.1 pp, 95% CI -2.8 to -1.4</w:t>
-            </w:r>
-          </w:p>
-        </w:tc>
-        <w:tc>
-          <w:tcPr/>
-          <w:p>
-            <w:pPr>
-              <w:pStyle w:val="Compact"/>
-              <w:jc w:val="left"/>
-            </w:pPr>
-            <w:r>
-              <w:t xml:space="preserve">-1.7 pp, 95% CI -2.3 to -1.1</w:t>
-            </w:r>
-          </w:p>
-        </w:tc>
-        <w:tc>
-          <w:tcPr/>
-          <w:p>
-            <w:pPr>
-              <w:pStyle w:val="Compact"/>
-              <w:jc w:val="left"/>
-            </w:pPr>
-            <w:r>
-              <w:t xml:space="preserve">3, effect shown in one model only</w:t>
-            </w:r>
-          </w:p>
-        </w:tc>
-        <w:tc>
-          <w:tcPr/>
-          <w:p>
-            <w:pPr>
-              <w:pStyle w:val="Compact"/>
-              <w:jc w:val="left"/>
-            </w:pPr>
-            <w:r>
-              <w:t xml:space="preserve">-</w:t>
-            </w:r>
-          </w:p>
-        </w:tc>
-      </w:tr>
-      <w:tr>
-        <w:tc>
-          <w:tcPr/>
-          <w:p>
-            <w:pPr>
-              <w:pStyle w:val="Compact"/>
-              <w:jc w:val="left"/>
-            </w:pPr>
-            <w:r>
-              <w:t xml:space="preserve">population: Korean minus global</w:t>
-            </w:r>
-          </w:p>
-        </w:tc>
-        <w:tc>
-          <w:tcPr/>
-          <w:p>
-            <w:pPr>
-              <w:pStyle w:val="Compact"/>
-              <w:jc w:val="left"/>
-            </w:pPr>
-            <w:r>
-              <w:t xml:space="preserve">Vmax upper 50% crossing</w:t>
-            </w:r>
-          </w:p>
-        </w:tc>
-        <w:tc>
-          <w:tcPr/>
-          <w:p>
-            <w:pPr>
-              <w:pStyle w:val="Compact"/>
-              <w:jc w:val="left"/>
-            </w:pPr>
-            <w:r>
-              <w:t xml:space="preserve">1.2 pp, 95% CI 0.5 to 1.9</w:t>
-            </w:r>
-          </w:p>
-        </w:tc>
-        <w:tc>
-          <w:tcPr/>
-          <w:p>
-            <w:pPr>
-              <w:pStyle w:val="Compact"/>
-              <w:jc w:val="left"/>
-            </w:pPr>
-            <w:r>
-              <w:t xml:space="preserve">0.9 pp, 95% CI 0.3 to 1.6</w:t>
+              <w:t xml:space="preserve">Vmax upper 50% crossing (pp)</w:t>
+            </w:r>
+          </w:p>
+        </w:tc>
+        <w:tc>
+          <w:tcPr/>
+          <w:p>
+            <w:pPr>
+              <w:pStyle w:val="Compact"/>
+              <w:jc w:val="left"/>
+            </w:pPr>
+            <w:r>
+              <w:t xml:space="preserve">1.2 (0.5 to 1.9)</w:t>
+            </w:r>
+          </w:p>
+        </w:tc>
+        <w:tc>
+          <w:tcPr/>
+          <w:p>
+            <w:pPr>
+              <w:pStyle w:val="Compact"/>
+              <w:jc w:val="left"/>
+            </w:pPr>
+            <w:r>
+              <w:t xml:space="preserve">0.9 (0.3 to 1.6)</w:t>
             </w:r>
           </w:p>
         </w:tc>
@@ -5878,7 +5731,7 @@
         <w:pStyle w:val="BodyText"/>
       </w:pPr>
       <w:r>
-        <w:t xml:space="preserve">Of the 44 design contrasts above, 42 point the same way in both models or show no material effect in either (classes 1 and 2), so the design conclusions drawn from them are the same under Kovalenko 2016 (Kovalenko 2016 is consistent with the pooled 300 mg AUC0-last of the healthy-volunteer studies; predicted/observed 1.027); 2 show an effect in one model only and 0 disagree in direction.</w:t>
+        <w:t xml:space="preserve">Of the 44 design contrasts above, 42 point the same way in both models or show no material effect in either (classes 1 and 2), so the design conclusions drawn from them are the same under Kovalenko 2016 (Kovalenko 2016 pooled 300 mg AUC0-last predicted/observed 1.027, 95% prediction interval 0.950 to 1.110; over-prediction not shown); 2 show an effect in one model only and 0 disagree in direction.</w:t>
       </w:r>
     </w:p>
     <w:p>
@@ -5886,7 +5739,7 @@
         <w:pStyle w:val="BodyText"/>
       </w:pPr>
       <w:r>
-        <w:t xml:space="preserve">Conclusions supported by both models (classes 1 and 2 only):</w:t>
+        <w:t xml:space="preserve">Conclusions supported by both models (classes 1 and 2 only; values in the table above):</w:t>
       </w:r>
     </w:p>
     <w:p>
@@ -5898,7 +5751,7 @@
         <w:pStyle w:val="Compact"/>
       </w:pPr>
       <w:r>
-        <w:t xml:space="preserve">schedule: extended schedule minus confirmed (global): no material change in either model: power at true GMR 0.95 (largest difference -0.2 pp, 95% CI -0.7 to 0.2), AUROC (10% F difference) (largest difference -0.001, 95% CI -0.003 to 0.002), F lower 50% crossing (largest difference 0.0 pp, 95% CI 0.0 to 0.0), F upper 50% crossing (largest difference 0.0 pp, 95% CI -0.1 to 0.0), lambda_z success (largest difference 0.0 pp, 95% CI 0.0 to 0.1), reliable-terminal-phase share (largest difference 0.4 pp, 95% CI 0.3 to 0.5), median AUC0-last error (largest difference 0.0 pp, 95% CI 0.0 to 0.0), RMSE of the AUC0-last log ratio (largest difference 0.000, 95% CI 0.000 to 0.000).</w:t>
+        <w:t xml:space="preserve">schedule: extended schedule minus confirmed (global): no material change in either model: power at true GMR 0.95, AUROC (10% F difference), F lower 50% crossing, F upper 50% crossing, lambda_z success, reliable-terminal-phase share, median AUC0-last error, RMSE of the AUC0-last log ratio.</w:t>
       </w:r>
     </w:p>
     <w:p>
@@ -5910,7 +5763,7 @@
         <w:pStyle w:val="Compact"/>
       </w:pPr>
       <w:r>
-        <w:t xml:space="preserve">schedule: reduced schedule minus confirmed (global): higher in both models: power at true GMR 0.95 (smaller difference 2.0 pp, 95% CI 1.3 to 3.1), RMSE of the AUC0-last log ratio (smaller difference 0.047, 95% CI 0.046 to 0.048); lower in both models: AUROC (10% F difference) (smaller difference -0.064, 95% CI -0.075 to -0.052), lambda_z success (smaller difference -27.4 pp, 95% CI -28.0 to -26.7), reliable-terminal-phase share (smaller difference -34.5 pp, 95% CI -35.3 to -33.8), median AUC0-last error (smaller difference -5.0 pp, 95% CI -5.2 to -4.9); no material change in either model: F lower 50% crossing (largest difference -1.0 pp, 95% CI -1.1 to -0.9), F upper 50% crossing (largest difference 1.8 pp, 95% CI 1.6 to 2.0).</w:t>
+        <w:t xml:space="preserve">schedule: reduced schedule minus confirmed (global): higher in both models: power at true GMR 0.95, RMSE of the AUC0-last log ratio; lower in both models: AUROC (10% F difference), lambda_z success, reliable-terminal-phase share; further from 0 in both models: median AUC0-last error; no material change in either model: F lower 50% crossing, F upper 50% crossing.</w:t>
       </w:r>
     </w:p>
     <w:p>
@@ -5922,7 +5775,7 @@
         <w:pStyle w:val="Compact"/>
       </w:pPr>
       <w:r>
-        <w:t xml:space="preserve">stratification: stratified minus unstratified analysis (global): no material change in either model: power at true GMR 0.95 (largest difference 0.7 pp, 95% CI 0.3 to 1.4).</w:t>
+        <w:t xml:space="preserve">stratification: stratified minus unstratified analysis (global): no material change in either model: power at true GMR 0.95.</w:t>
       </w:r>
     </w:p>
     <w:p>
@@ -5934,7 +5787,7 @@
         <w:pStyle w:val="Compact"/>
       </w:pPr>
       <w:r>
-        <w:t xml:space="preserve">stratification: median minus 75 kg boundary (global): no material change in either model: power at true GMR 0.95 (largest difference -0.5 pp, 95% CI -2.3 to 1.3).</w:t>
+        <w:t xml:space="preserve">stratification: median minus 75 kg boundary (global): no material change in either model: power at true GMR 0.95.</w:t>
       </w:r>
     </w:p>
     <w:p>
@@ -5946,7 +5799,7 @@
         <w:pStyle w:val="Compact"/>
       </w:pPr>
       <w:r>
-        <w:t xml:space="preserve">schedule: extended schedule minus confirmed (Korean): no material change in either model: power at true GMR 0.95 (largest difference -0.2 pp, 95% CI -0.7 to 0.2), AUROC (10% F difference) (largest difference 0.004, 95% CI 0.000 to 0.007), F lower 50% crossing (largest difference 0.0 pp, 95% CI 0.0 to 0.0), F upper 50% crossing (largest difference -0.1 pp, 95% CI -0.1 to 0.0), lambda_z success (largest difference 0.1 pp, 95% CI 0.0 to 0.1), reliable-terminal-phase share (largest difference 0.7 pp, 95% CI 0.6 to 0.9), median AUC0-last error (largest difference 0.0 pp, 95% CI 0.0 to 0.0), RMSE of the AUC0-last log ratio (largest difference 0.000, 95% CI 0.000 to 0.000).</w:t>
+        <w:t xml:space="preserve">schedule: extended schedule minus confirmed (Korean): no material change in either model: power at true GMR 0.95, AUROC (10% F difference), F lower 50% crossing, F upper 50% crossing, lambda_z success, reliable-terminal-phase share, median AUC0-last error, RMSE of the AUC0-last log ratio.</w:t>
       </w:r>
     </w:p>
     <w:p>
@@ -5958,7 +5811,7 @@
         <w:pStyle w:val="Compact"/>
       </w:pPr>
       <w:r>
-        <w:t xml:space="preserve">schedule: reduced schedule minus confirmed (Korean): higher in both models: RMSE of the AUC0-last log ratio (smaller difference 0.057, 95% CI 0.056 to 0.059); lower in both models: AUROC (10% F difference) (smaller difference -0.077, 95% CI -0.089 to -0.064), lambda_z success (smaller difference -31.8 pp, 95% CI -32.4 to -31.2), reliable-terminal-phase share (smaller difference -39.6 pp, 95% CI -40.4 to -38.9), median AUC0-last error (smaller difference -6.2 pp, 95% CI -6.3 to -6.0); no material change in either model: F lower 50% crossing (largest difference -1.3 pp, 95% CI -1.5 to -1.1), F upper 50% crossing (largest difference 1.5 pp, 95% CI 1.3 to 1.7).</w:t>
+        <w:t xml:space="preserve">schedule: reduced schedule minus confirmed (Korean): lower in both models: AUROC (10% F difference), lambda_z success, reliable-terminal-phase share; further from 0 in both models: median AUC0-last error; higher in both models: RMSE of the AUC0-last log ratio; no material change in either model: F lower 50% crossing, F upper 50% crossing.</w:t>
       </w:r>
     </w:p>
     <w:p>
@@ -5970,7 +5823,7 @@
         <w:pStyle w:val="Compact"/>
       </w:pPr>
       <w:r>
-        <w:t xml:space="preserve">stratification: stratified minus unstratified analysis (Korean): no material change in either model: power at true GMR 0.95 (largest difference 0.1 pp, 95% CI -0.5 to 0.8).</w:t>
+        <w:t xml:space="preserve">stratification: stratified minus unstratified analysis (Korean): no material change in either model: power at true GMR 0.95.</w:t>
       </w:r>
     </w:p>
     <w:p>
@@ -5982,7 +5835,7 @@
         <w:pStyle w:val="Compact"/>
       </w:pPr>
       <w:r>
-        <w:t xml:space="preserve">stratification: median minus 75 kg boundary (Korean): no material change in either model: power at true GMR 0.95 (largest difference 0.6 pp, 95% CI -1.2 to 2.4).</w:t>
+        <w:t xml:space="preserve">stratification: median minus 75 kg boundary (Korean): no material change in either model: power at true GMR 0.95.</w:t>
       </w:r>
     </w:p>
     <w:p>
@@ -5994,7 +5847,7 @@
         <w:pStyle w:val="Compact"/>
       </w:pPr>
       <w:r>
-        <w:t xml:space="preserve">population: Korean minus global: no material change in either model: power at true GMR 0.95 (largest difference 0.9 pp, 95% CI -0.6 to 2.4), AUROC (10% F difference) (largest difference -0.009, 95% CI -0.020 to 0.003), F lower 50% crossing (largest difference -0.2 pp, 95% CI -0.3 to 0.0), F upper 50% crossing (largest difference 0.5 pp, 95% CI 0.2 to 0.8), ke lower 50% crossing (largest difference 0.4 pp, 95% CI -0.1 to 0.9), ke upper 50% crossing (largest difference -1.0 pp, 95% CI -1.8 to -0.2), Vmax upper 50% crossing (largest difference 1.2 pp, 95% CI 0.5 to 1.9).</w:t>
+        <w:t xml:space="preserve">population: Korean minus global: no material change in either model: power at true GMR 0.95, AUROC (10% F difference), F lower 50% crossing, F upper 50% crossing, ke lower 50% crossing, ke upper 50% crossing, Vmax upper 50% crossing.</w:t>
       </w:r>
     </w:p>
     <w:p>
@@ -6184,7 +6037,7 @@
               <w:jc w:val="left"/>
             </w:pPr>
             <w:r>
-              <w:t xml:space="preserve">Studies without reported weights assume a normal 78 kg (SD 10 kg) mean weight; results depend on it.</w:t>
+              <w:t xml:space="preserve">For studies without reported weights, subject weights are drawn from a normal mean 78 kg (80 kg for PKM14271), SD 10 kg, sex-specific default bounds (bounds 50 to 100 kg for men, 40 to 90 kg for women; assumption B14); the uncertain-mean assumption draws one study mean per replicate uniformly within plus or minus 8 kg. Pooled 300 mg AUC0-last predicted/observed at fixed study means of 70 and 86 kg: 1.243 and 1.025 for Model 1, 1.146 and 0.943 for Kovalenko 2016.</w:t>
             </w:r>
           </w:p>
         </w:tc>
@@ -6493,8 +6346,8 @@
     <w:rPrDefault>
       <w:rPr>
         <w:rFonts w:asciiTheme="minorHAnsi" w:cstheme="minorBidi" w:eastAsiaTheme="minorHAnsi" w:hAnsiTheme="minorHAnsi"/>
-        <w:sz w:val="24"/>
-        <w:szCs w:val="24"/>
+        <w:sz w:val="20"/>
+        <w:szCs w:val="20"/>
         <w:lang w:bidi="ar-SA" w:eastAsia="en-US" w:val="en-US"/>
       </w:rPr>
     </w:rPrDefault>
@@ -6531,6 +6384,10 @@
     <w:pPr>
       <w:spacing w:after="36" w:before="36"/>
     </w:pPr>
+    <w:rPr>
+      <w:sz w:val="17"/>
+      <w:szCs w:val="17"/>
+    </w:rPr>
   </w:style>
   <w:style w:styleId="Title" w:type="paragraph">
     <w:name w:val="Title"/>

</xml_diff>

<commit_message>
M15 amendment 1 P1 outputs regenerated at the re-verification fix commit (p1report, appendix)
Co-Authored-By: Claude Opus 5.5 <noreply@anthropic.com>
Claude-Session: https://claude.ai/code/session_01VcVRPzFxTqkW2KRC1Wkk1r
</commit_message>
<xml_diff>
--- a/results/m15/amend1/appendix/M15_MS_appendix_draft.docx
+++ b/results/m15/amend1/appendix/M15_MS_appendix_draft.docx
@@ -16,7 +16,7 @@
         <w:pStyle w:val="FirstParagraph"/>
       </w:pPr>
       <w:r>
-        <w:t xml:space="preserve">Draft for the European Medicines Agency (EMA) scientific advice briefing document. Structured as in the International Council for Harmonisation (ICH) M15 guideline. Generated on 2026-10-21 from the result files at commit 8df65d0 (plan</w:t>
+        <w:t xml:space="preserve">Draft for the European Medicines Agency (EMA) scientific advice briefing document. Structured as in the International Council for Harmonisation (ICH) M15 guideline. Generated on 2026-10-21 from the result files at commit 52c4d09 (plan</w:t>
       </w:r>
       <w:r>
         <w:t xml:space="preserve"> </w:t>
@@ -489,7 +489,7 @@
         <w:pStyle w:val="FirstParagraph"/>
       </w:pPr>
       <w:r>
-        <w:t xml:space="preserve">Arm means simulated 5,000 times with each study's design, dose, schedule and LLOQ (0.078 mg/L) under the registered fixed weight assumption (where weights are not reported, normal mean 78 kg (80 kg for PKM14271), SD 10 kg, sex-specific default bounds; assumption B14). Each cell: predicted median (99% prediction interval); predicted/observed ratio; in-sample status.</w:t>
+        <w:t xml:space="preserve">Arm means simulated 5,000 times with each study's design, dose, schedule and LLOQ (0.078 mg/L) under the registered fixed weight assumption (where weights are not reported, subject weights from a normal distribution with mean 78 kg (80 kg for PKM14271) and SD 10 kg; assumption B14). Each cell: predicted median (99% prediction interval); predicted/observed ratio; in-sample status.</w:t>
       </w:r>
     </w:p>
     <w:tbl>
@@ -1496,7 +1496,7 @@
               <w:jc w:val="left"/>
             </w:pPr>
             <w:r>
-              <w:t xml:space="preserve">confirmed schedule: elapsed days 0.25, 1, 3, 5, 7, 10, 14, 21, 28, 35, 42, 49, 56; reduced schedule: elapsed days 0.25, 1, 3, 5, 7, 10, 14, 21, 28, 56; extended schedule: elapsed days 0.25, 1, 3, 5, 7, 10, 14, 21, 28, 35, 42, 49, 56, 63, 70</w:t>
+              <w:t xml:space="preserve">confirmed schedule: elapsed days 0.25, 1, 3, 5, 7, 10, 14, 21, 28, 35, 42, 49, 56; reduced schedule: elapsed days 0.25, 1, 3, 5, 7, 10, 14, 21, 28, 56; extended schedule: elapsed days 0.25, 1, 3, 5, 7, 10, 14, 21, 28, 35, 42, 49, 56, 63, 70. Day convention: study Day d = elapsed day d - 1 after the dose (elapsed day 56 is Day 57; elapsed days 63 and 70 are Days 64 and 71; the anti-drug antibody days 15, 29 and 85 are elapsed days 14, 28 and 84).</w:t>
             </w:r>
           </w:p>
         </w:tc>
@@ -1934,7 +1934,7 @@
         <w:pStyle w:val="BodyText"/>
       </w:pPr>
       <w:r>
-        <w:t xml:space="preserve">Intervals are Wilson 95% intervals of the simulation (Monte Carlo) error only; they do not include parameter or model uncertainty. Korean-population operating characteristics other than power at GMR 0.95 (section 5.2) are not part of the P1 report and are not shown (plan section 16.6).</w:t>
+        <w:t xml:space="preserve">Intervals are Wilson 95% intervals of the simulation (Monte Carlo) error only; they do not include parameter or model uncertainty. Korean-population operating characteristics other than power at GMR 0.95 (section 5.2) are not included in this draft (plan section 16.6).</w:t>
       </w:r>
     </w:p>
     <w:bookmarkEnd w:id="24"/>
@@ -3417,7 +3417,7 @@
         <w:pStyle w:val="BodyText"/>
       </w:pPr>
       <w:r>
-        <w:t xml:space="preserve">Korean values for 85% power and for assurance are not part of the P1 report and are not shown (plan section 16.6).</w:t>
+        <w:t xml:space="preserve">Korean values for 85% power and for assurance are not included in this draft (plan section 16.6).</w:t>
       </w:r>
     </w:p>
     <w:bookmarkEnd w:id="26"/>
@@ -3679,7 +3679,7 @@
         <w:pStyle w:val="BodyText"/>
       </w:pPr>
       <w:r>
-        <w:t xml:space="preserve">The two models' weight ratios are near-equal by coincidence: weight acts only on the central volume in both models, and the exponent times the normalized bioavailability sensitivity of AUC0-inf at the global median weight (76.0 kg) is 0.711 x 1.564 = 1.112 for Model 1 and 0.705 x 1.574 = 1.110 for Kovalenko 2016. Each model was confirmed to run with its own exponent (independent recomputation of every stored ratio).</w:t>
+        <w:t xml:space="preserve">The two models' weight ratios are near-equal by coincidence: weight acts only on the central volume in both models, and the exponent times the normalized bioavailability sensitivity of AUC0-inf at the 75 kg reference weight is 0.711 x 1.561 = 1.110 for Model 1 and 0.705 x 1.571 = 1.107 for Kovalenko 2016. Each model was confirmed to run with its own exponent (independent recomputation of every stored ratio).</w:t>
       </w:r>
     </w:p>
     <w:bookmarkEnd w:id="27"/>
@@ -6037,7 +6037,7 @@
               <w:jc w:val="left"/>
             </w:pPr>
             <w:r>
-              <w:t xml:space="preserve">For studies without reported weights, subject weights are drawn from a normal mean 78 kg (80 kg for PKM14271), SD 10 kg, sex-specific default bounds (bounds 50 to 100 kg for men, 40 to 90 kg for women; assumption B14); the uncertain-mean assumption draws one study mean per replicate uniformly within plus or minus 8 kg. Pooled 300 mg AUC0-last predicted/observed at fixed study means of 70 and 86 kg: 1.243 and 1.025 for Model 1, 1.146 and 0.943 for Kovalenko 2016.</w:t>
+              <w:t xml:space="preserve">For studies without reported weights, subject weights are drawn from a normal distribution with mean 78 kg (80 kg for PKM14271) and SD 10 kg, truncated to 50 to 100 kg for men and 40 to 90 kg for women (assumption B14); the uncertain-mean assumption draws one study mean per replicate uniformly within plus or minus 8 kg. Pooled 300 mg AUC0-last predicted/observed at assumed study means of 70 and 86 kg (simulated mean weights 70.0 and 82.4 kg): 1.243 and 1.025 for Model 1, 1.146 and 0.943 for Kovalenko 2016.</w:t>
             </w:r>
           </w:p>
         </w:tc>
@@ -6149,7 +6149,10 @@
     </w:tbl>
     <w:bookmarkEnd w:id="30"/>
     <w:bookmarkEnd w:id="31"/>
-    <w:sectPr/>
+    <w:sectPr>
+      <w:pgSz w:h="16838" w:w="11906"/>
+      <w:pgMar w:bottom="1134" w:footer="567" w:gutter="0" w:header="567" w:left="1134" w:right="1134" w:top="1134"/>
+    </w:sectPr>
   </w:body>
 </w:document>
 </file>

</xml_diff>